<commit_message>
Publish reviewed résumé layout and synchronized downloads
</commit_message>
<xml_diff>
--- a/resume.docx
+++ b/resume.docx
@@ -5,7 +5,8 @@
     <w:bookmarkStart w:id="23" w:name="brian-merriman"/>
     <w:p>
       <w:pPr>
-        <w:pStyle w:val="Heading1"/>
+        <w:pStyle w:val="Title"/>
+        <w:jc w:val="left"/>
       </w:pPr>
       <w:r>
         <w:t xml:space="preserve">Brian Merriman</w:t>
@@ -14,6 +15,7 @@
     <w:p>
       <w:pPr>
         <w:pStyle w:val="FirstParagraph"/>
+        <w:jc w:val="left"/>
       </w:pPr>
       <w:r>
         <w:t xml:space="preserve">Senior Frontend Engineer | Frontend Software Engineer | Complex Data Applications</w:t>
@@ -22,6 +24,7 @@
     <w:p>
       <w:pPr>
         <w:pStyle w:val="BodyText"/>
+        <w:jc w:val="left"/>
       </w:pPr>
       <w:r>
         <w:t xml:space="preserve">New York, NY |</w:t>
@@ -77,6 +80,7 @@
     <w:p>
       <w:pPr>
         <w:pStyle w:val="Heading2"/>
+        <w:jc w:val="left"/>
       </w:pPr>
       <w:r>
         <w:t xml:space="preserve">Professional Summary</w:t>
@@ -85,9 +89,10 @@
     <w:p>
       <w:pPr>
         <w:pStyle w:val="FirstParagraph"/>
-      </w:pPr>
-      <w:r>
-        <w:t xml:space="preserve">Senior frontend engineer with 4+ years of experience building and shipping high-performance JavaScript applications for complex data and operational workflows. At JPMorgan Chase, served as primary frontend engineer for a multi-grid analytics workspace and earned promotion to Lead Software Engineer (Vice President) in two years. Expertise in frontend performance, virtualized rendering, WebSockets, state management, local-first architecture, Node.js, and SQL. Seeking a full-time Senior Frontend Engineer or Frontend Software Engineer role.</w:t>
+        <w:jc w:val="left"/>
+      </w:pPr>
+      <w:r>
+        <w:t xml:space="preserve">Senior frontend engineer building JavaScript applications for complex data and operational workflows. Primary frontend engineer during the first year of a JPMorgan Chase analytics workspace for large data sets; promoted to Lead Software Engineer (Vice President) after two years. Now building local-first software. Available now for full-time frontend roles in NYC, on-site, hybrid, or remote.</w:t>
       </w:r>
     </w:p>
     <w:bookmarkEnd w:id="24"/>
@@ -95,6 +100,7 @@
     <w:p>
       <w:pPr>
         <w:pStyle w:val="Heading2"/>
+        <w:jc w:val="left"/>
       </w:pPr>
       <w:r>
         <w:t xml:space="preserve">Skills</w:t>
@@ -103,6 +109,7 @@
     <w:p>
       <w:pPr>
         <w:pStyle w:val="FirstParagraph"/>
+        <w:jc w:val="left"/>
       </w:pPr>
       <w:r>
         <w:rPr>
@@ -121,6 +128,7 @@
     <w:p>
       <w:pPr>
         <w:pStyle w:val="BodyText"/>
+        <w:jc w:val="left"/>
       </w:pPr>
       <w:r>
         <w:rPr>
@@ -139,6 +147,7 @@
     <w:p>
       <w:pPr>
         <w:pStyle w:val="BodyText"/>
+        <w:jc w:val="left"/>
       </w:pPr>
       <w:r>
         <w:rPr>
@@ -157,6 +166,7 @@
     <w:p>
       <w:pPr>
         <w:pStyle w:val="BodyText"/>
+        <w:jc w:val="left"/>
       </w:pPr>
       <w:r>
         <w:rPr>
@@ -177,6 +187,7 @@
     <w:p>
       <w:pPr>
         <w:pStyle w:val="Heading2"/>
+        <w:jc w:val="left"/>
       </w:pPr>
       <w:r>
         <w:t xml:space="preserve">Work Experience</w:t>
@@ -186,6 +197,7 @@
     <w:p>
       <w:pPr>
         <w:pStyle w:val="Heading3"/>
+        <w:jc w:val="left"/>
       </w:pPr>
       <w:r>
         <w:t xml:space="preserve">JPMorgan Chase | Lead Software Engineer (Vice President)</w:t>
@@ -194,6 +206,7 @@
     <w:p>
       <w:pPr>
         <w:pStyle w:val="FirstParagraph"/>
+        <w:jc w:val="left"/>
       </w:pPr>
       <w:r>
         <w:t xml:space="preserve">New York, NY | February 2025 - May 2026</w:t>
@@ -206,6 +219,7 @@
           <w:ilvl w:val="0"/>
           <w:numId w:val="1001"/>
         </w:numPr>
+        <w:jc w:val="left"/>
       </w:pPr>
       <w:r>
         <w:t xml:space="preserve">Promoted from Software Engineer III (Associate) to Lead Software Engineer (Vice President) in two years.</w:t>
@@ -218,6 +232,7 @@
           <w:ilvl w:val="0"/>
           <w:numId w:val="1001"/>
         </w:numPr>
+        <w:jc w:val="left"/>
       </w:pPr>
       <w:r>
         <w:t xml:space="preserve">Evaluated large language model (LLM) workflows for legacy application modernization and created reusable project guidance and user interface (UI) component constraints for AI-generated code.</w:t>
@@ -228,6 +243,7 @@
     <w:p>
       <w:pPr>
         <w:pStyle w:val="Heading3"/>
+        <w:jc w:val="left"/>
       </w:pPr>
       <w:r>
         <w:t xml:space="preserve">JPMorgan Chase | Software Engineer III (Associate)</w:t>
@@ -236,6 +252,7 @@
     <w:p>
       <w:pPr>
         <w:pStyle w:val="FirstParagraph"/>
+        <w:jc w:val="left"/>
       </w:pPr>
       <w:r>
         <w:t xml:space="preserve">New York, NY | January 2023 - January 2025</w:t>
@@ -248,6 +265,7 @@
           <w:ilvl w:val="0"/>
           <w:numId w:val="1002"/>
         </w:numPr>
+        <w:jc w:val="left"/>
       </w:pPr>
       <w:r>
         <w:t xml:space="preserve">Served as primary frontend engineer during the product’s first year, building a high-performance multi-grid analytics workspace on a small, fast-moving team.</w:t>
@@ -260,9 +278,10 @@
           <w:ilvl w:val="0"/>
           <w:numId w:val="1002"/>
         </w:numPr>
-      </w:pPr>
-      <w:r>
-        <w:t xml:space="preserve">Enabled users to explore, join, pivot, and retrieve server-held datasets containing 100M+ rows.</w:t>
+        <w:jc w:val="left"/>
+      </w:pPr>
+      <w:r>
+        <w:t xml:space="preserve">Enabled users to explore, join, pivot, and retrieve large server-held data sets.</w:t>
       </w:r>
     </w:p>
     <w:p>
@@ -272,6 +291,7 @@
           <w:ilvl w:val="0"/>
           <w:numId w:val="1002"/>
         </w:numPr>
+        <w:jc w:val="left"/>
       </w:pPr>
       <w:r>
         <w:t xml:space="preserve">Implemented virtualized rendering, visible-window data fetching over WebSockets, client-side caching, and state management to keep every grid responsive.</w:t>
@@ -282,6 +302,7 @@
     <w:p>
       <w:pPr>
         <w:pStyle w:val="Heading3"/>
+        <w:jc w:val="left"/>
       </w:pPr>
       <w:r>
         <w:t xml:space="preserve">OKG Tech | Software Engineer</w:t>
@@ -290,6 +311,7 @@
     <w:p>
       <w:pPr>
         <w:pStyle w:val="FirstParagraph"/>
+        <w:jc w:val="left"/>
       </w:pPr>
       <w:r>
         <w:t xml:space="preserve">New York, NY | March 2022 - December 2022</w:t>
@@ -302,9 +324,10 @@
           <w:ilvl w:val="0"/>
           <w:numId w:val="1003"/>
         </w:numPr>
-      </w:pPr>
-      <w:r>
-        <w:t xml:space="preserve">Shipped an updated bus-ticketing application using React and Node.js as the primary implementation engineer on a team of four.</w:t>
+        <w:jc w:val="left"/>
+      </w:pPr>
+      <w:r>
+        <w:t>Primary implementation engineer on a four-person team, developing an updated bus-ticketing system in React and Node.js.</w:t>
       </w:r>
     </w:p>
     <w:p>
@@ -314,9 +337,10 @@
           <w:ilvl w:val="0"/>
           <w:numId w:val="1003"/>
         </w:numPr>
-      </w:pPr>
-      <w:r>
-        <w:t xml:space="preserve">Developed scheduling, vaccination, appointment reminder, and clinical workflow features integrated with eClinicalWorks and existing operational systems.</w:t>
+        <w:jc w:val="left"/>
+      </w:pPr>
+      <w:r>
+        <w:t>Developed scheduling, vaccination, appointment-reminder, and clinical-workflow features against eClinicalWorks and existing operational systems.</w:t>
       </w:r>
     </w:p>
     <w:bookmarkEnd w:id="28"/>
@@ -324,6 +348,7 @@
     <w:p>
       <w:pPr>
         <w:pStyle w:val="Heading3"/>
+        <w:jc w:val="left"/>
       </w:pPr>
       <w:r>
         <w:t xml:space="preserve">Yunshang Tea | Co-Founder</w:t>
@@ -332,6 +357,7 @@
     <w:p>
       <w:pPr>
         <w:pStyle w:val="FirstParagraph"/>
+        <w:jc w:val="left"/>
       </w:pPr>
       <w:r>
         <w:t xml:space="preserve">Zhejiang, China | September 2015 - November 2021</w:t>
@@ -344,6 +370,7 @@
           <w:ilvl w:val="0"/>
           <w:numId w:val="1004"/>
         </w:numPr>
+        <w:jc w:val="left"/>
       </w:pPr>
       <w:r>
         <w:t xml:space="preserve">Managed retail and wholesale operations for a specialty tea business.</w:t>
@@ -356,6 +383,7 @@
           <w:ilvl w:val="0"/>
           <w:numId w:val="1004"/>
         </w:numPr>
+        <w:jc w:val="left"/>
       </w:pPr>
       <w:r>
         <w:t xml:space="preserve">Built database workflows for inventory, sales, and business operations.</w:t>
@@ -367,6 +395,7 @@
     <w:p>
       <w:pPr>
         <w:pStyle w:val="Heading2"/>
+        <w:jc w:val="left"/>
       </w:pPr>
       <w:r>
         <w:t xml:space="preserve">Selected Projects</w:t>
@@ -379,6 +408,7 @@
           <w:ilvl w:val="0"/>
           <w:numId w:val="1005"/>
         </w:numPr>
+        <w:jc w:val="left"/>
       </w:pPr>
       <w:hyperlink r:id="rId31">
         <w:r>
@@ -418,6 +448,7 @@
           <w:ilvl w:val="0"/>
           <w:numId w:val="1005"/>
         </w:numPr>
+        <w:jc w:val="left"/>
       </w:pPr>
       <w:hyperlink r:id="rId32">
         <w:r>
@@ -447,7 +478,7 @@
         <w:t xml:space="preserve"> </w:t>
       </w:r>
       <w:r>
-        <w:t xml:space="preserve">Built an automated nightly Major League Baseball (MLB) ratings and data visualization publication derived from 8M+ Statcast pitches; benchmarked the models against betting markets and published the negative result.</w:t>
+        <w:t xml:space="preserve">Built an automated nightly Major League Baseball (MLB) ratings publication using Elo to rate hitters and pitchers from plate appearances.</w:t>
       </w:r>
     </w:p>
     <w:bookmarkEnd w:id="33"/>
@@ -455,6 +486,7 @@
     <w:p>
       <w:pPr>
         <w:pStyle w:val="Heading2"/>
+        <w:jc w:val="left"/>
       </w:pPr>
       <w:r>
         <w:t xml:space="preserve">Education</w:t>
@@ -464,6 +496,7 @@
     <w:p>
       <w:pPr>
         <w:pStyle w:val="Heading3"/>
+        <w:jc w:val="left"/>
       </w:pPr>
       <w:r>
         <w:t xml:space="preserve">Manhattan College | Bachelor of Arts (BA) in Computer Science</w:t>
@@ -472,6 +505,7 @@
     <w:p>
       <w:pPr>
         <w:pStyle w:val="FirstParagraph"/>
+        <w:jc w:val="left"/>
       </w:pPr>
       <w:r>
         <w:t xml:space="preserve">Bronx, NY | Magna cum laude | Phi Beta Kappa</w:t>
@@ -483,6 +517,8 @@
       <w:footnotePr>
         <w:numRestart w:val="eachSect"/>
       </w:footnotePr>
+      <w:pgSz w:h="15840" w:w="12240"/>
+      <w:pgMar w:bottom="720" w:left="893" w:right="893" w:top="720"/>
     </w:sectPr>
   </w:body>
 </w:document>
@@ -521,7 +557,7 @@
       <w:lvlText w:val=" "/>
       <w:lvlJc w:val="left"/>
       <w:pPr>
-        <w:ind w:left="720" w:hanging="360"/>
+        <w:ind w:left="220" w:hanging="180"/>
       </w:pPr>
     </w:lvl>
     <w:lvl w:ilvl="1">
@@ -529,7 +565,7 @@
       <w:lvlText w:val=" "/>
       <w:lvlJc w:val="left"/>
       <w:pPr>
-        <w:ind w:left="1440" w:hanging="360"/>
+        <w:ind w:left="220" w:hanging="180"/>
       </w:pPr>
     </w:lvl>
     <w:lvl w:ilvl="2">
@@ -537,7 +573,7 @@
       <w:lvlText w:val=" "/>
       <w:lvlJc w:val="left"/>
       <w:pPr>
-        <w:ind w:left="2160" w:hanging="360"/>
+        <w:ind w:left="220" w:hanging="180"/>
       </w:pPr>
     </w:lvl>
     <w:lvl w:ilvl="3">
@@ -545,7 +581,7 @@
       <w:lvlText w:val=" "/>
       <w:lvlJc w:val="left"/>
       <w:pPr>
-        <w:ind w:left="2880" w:hanging="360"/>
+        <w:ind w:left="220" w:hanging="180"/>
       </w:pPr>
     </w:lvl>
     <w:lvl w:ilvl="4">
@@ -553,7 +589,7 @@
       <w:lvlText w:val=" "/>
       <w:lvlJc w:val="left"/>
       <w:pPr>
-        <w:ind w:left="3600" w:hanging="360"/>
+        <w:ind w:left="220" w:hanging="180"/>
       </w:pPr>
     </w:lvl>
     <w:lvl w:ilvl="5">
@@ -561,7 +597,7 @@
       <w:lvlText w:val=" "/>
       <w:lvlJc w:val="left"/>
       <w:pPr>
-        <w:ind w:left="4320" w:hanging="360"/>
+        <w:ind w:left="220" w:hanging="180"/>
       </w:pPr>
     </w:lvl>
     <w:lvl w:ilvl="6">
@@ -569,7 +605,7 @@
       <w:lvlText w:val=" "/>
       <w:lvlJc w:val="left"/>
       <w:pPr>
-        <w:ind w:left="5040" w:hanging="360"/>
+        <w:ind w:left="220" w:hanging="180"/>
       </w:pPr>
     </w:lvl>
     <w:lvl w:ilvl="7">
@@ -577,7 +613,7 @@
       <w:lvlText w:val=" "/>
       <w:lvlJc w:val="left"/>
       <w:pPr>
-        <w:ind w:left="5760" w:hanging="360"/>
+        <w:ind w:left="220" w:hanging="180"/>
       </w:pPr>
     </w:lvl>
     <w:lvl w:ilvl="8">
@@ -585,7 +621,7 @@
       <w:lvlText w:val=" "/>
       <w:lvlJc w:val="left"/>
       <w:pPr>
-        <w:ind w:left="6480" w:hanging="360"/>
+        <w:ind w:left="220" w:hanging="180"/>
       </w:pPr>
     </w:lvl>
   </w:abstractNum>
@@ -597,7 +633,7 @@
       <w:lvlText w:val=""/>
       <w:lvlJc w:val="left"/>
       <w:pPr>
-        <w:ind w:left="720" w:hanging="360"/>
+        <w:ind w:left="220" w:hanging="180"/>
       </w:pPr>
       <w:rPr>
         <w:rFonts w:ascii="Symbol" w:hAnsi="Symbol" w:cs="Symbol" w:hint="default"/>
@@ -608,7 +644,7 @@
       <w:lvlText w:val="o"/>
       <w:lvlJc w:val="left"/>
       <w:pPr>
-        <w:ind w:left="1440" w:hanging="360"/>
+        <w:ind w:left="220" w:hanging="180"/>
       </w:pPr>
       <w:rPr>
         <w:rFonts w:ascii="Courier New" w:hAnsi="Courier New" w:cs="Courier New" w:hint="default"/>
@@ -619,7 +655,7 @@
       <w:lvlText w:val=""/>
       <w:lvlJc w:val="left"/>
       <w:pPr>
-        <w:ind w:left="2160" w:hanging="360"/>
+        <w:ind w:left="220" w:hanging="180"/>
       </w:pPr>
       <w:rPr>
         <w:rFonts w:ascii="Wingdings" w:hAnsi="Wingdings" w:cs="Wingdings" w:hint="default"/>
@@ -630,7 +666,7 @@
       <w:lvlText w:val=""/>
       <w:lvlJc w:val="left"/>
       <w:pPr>
-        <w:ind w:left="2880" w:hanging="360"/>
+        <w:ind w:left="220" w:hanging="180"/>
       </w:pPr>
       <w:rPr>
         <w:rFonts w:ascii="Symbol" w:hAnsi="Symbol" w:cs="Symbol" w:hint="default"/>
@@ -641,7 +677,7 @@
       <w:lvlText w:val="o"/>
       <w:lvlJc w:val="left"/>
       <w:pPr>
-        <w:ind w:left="3600" w:hanging="360"/>
+        <w:ind w:left="220" w:hanging="180"/>
       </w:pPr>
       <w:rPr>
         <w:rFonts w:ascii="Courier New" w:hAnsi="Courier New" w:cs="Courier New" w:hint="default"/>
@@ -652,7 +688,7 @@
       <w:lvlText w:val=""/>
       <w:lvlJc w:val="left"/>
       <w:pPr>
-        <w:ind w:left="4320" w:hanging="360"/>
+        <w:ind w:left="220" w:hanging="180"/>
       </w:pPr>
       <w:rPr>
         <w:rFonts w:ascii="Wingdings" w:hAnsi="Wingdings" w:cs="Wingdings" w:hint="default"/>
@@ -663,7 +699,7 @@
       <w:lvlText w:val=""/>
       <w:lvlJc w:val="left"/>
       <w:pPr>
-        <w:ind w:left="5040" w:hanging="360"/>
+        <w:ind w:left="220" w:hanging="180"/>
       </w:pPr>
       <w:rPr>
         <w:rFonts w:ascii="Symbol" w:hAnsi="Symbol" w:cs="Symbol" w:hint="default"/>
@@ -674,7 +710,7 @@
       <w:lvlText w:val="o"/>
       <w:lvlJc w:val="left"/>
       <w:pPr>
-        <w:ind w:left="5760" w:hanging="360"/>
+        <w:ind w:left="220" w:hanging="180"/>
       </w:pPr>
       <w:rPr>
         <w:rFonts w:ascii="Courier New" w:hAnsi="Courier New" w:cs="Courier New" w:hint="default"/>
@@ -685,7 +721,7 @@
       <w:lvlText w:val=""/>
       <w:lvlJc w:val="left"/>
       <w:pPr>
-        <w:ind w:left="6480" w:hanging="360"/>
+        <w:ind w:left="220" w:hanging="180"/>
       </w:pPr>
       <w:rPr>
         <w:rFonts w:ascii="Wingdings" w:hAnsi="Wingdings" w:cs="Wingdings" w:hint="default"/>
@@ -734,6 +770,14 @@
   <w:style w:default="1" w:styleId="Normal" w:type="paragraph">
     <w:name w:val="Normal"/>
     <w:qFormat/>
+    <w:pPr>
+      <w:spacing w:after="40" w:before="0" w:line="252" w:lineRule="auto"/>
+    </w:pPr>
+    <w:rPr>
+      <w:rFonts w:ascii="Arial" w:hAnsi="Arial"/>
+      <w:color w:val="000000"/>
+      <w:sz w:val="20"/>
+    </w:rPr>
   </w:style>
   <w:style w:styleId="BodyText" w:type="paragraph">
     <w:name w:val="Body Text"/>
@@ -741,22 +785,40 @@
     <w:link w:val="BodyTextChar"/>
     <w:qFormat/>
     <w:pPr>
-      <w:spacing w:after="180" w:before="180"/>
-    </w:pPr>
+      <w:spacing w:after="40" w:before="0" w:line="252" w:lineRule="auto"/>
+    </w:pPr>
+    <w:rPr>
+      <w:rFonts w:ascii="Arial" w:hAnsi="Arial"/>
+      <w:color w:val="000000"/>
+      <w:sz w:val="20"/>
+    </w:rPr>
   </w:style>
   <w:style w:customStyle="1" w:styleId="FirstParagraph" w:type="paragraph">
     <w:name w:val="First Paragraph"/>
     <w:basedOn w:val="BodyText"/>
     <w:next w:val="BodyText"/>
     <w:qFormat/>
+    <w:pPr>
+      <w:spacing w:after="40" w:before="0" w:line="252" w:lineRule="auto"/>
+    </w:pPr>
+    <w:rPr>
+      <w:rFonts w:ascii="Arial" w:hAnsi="Arial"/>
+      <w:color w:val="000000"/>
+      <w:sz w:val="20"/>
+    </w:rPr>
   </w:style>
   <w:style w:customStyle="1" w:styleId="Compact" w:type="paragraph">
     <w:name w:val="Compact"/>
     <w:basedOn w:val="BodyText"/>
     <w:qFormat/>
     <w:pPr>
-      <w:spacing w:after="36" w:before="36"/>
-    </w:pPr>
+      <w:spacing w:after="40" w:before="0" w:line="252" w:lineRule="auto"/>
+    </w:pPr>
+    <w:rPr>
+      <w:rFonts w:ascii="Arial" w:hAnsi="Arial"/>
+      <w:color w:val="000000"/>
+      <w:sz w:val="20"/>
+    </w:rPr>
   </w:style>
   <w:style w:styleId="Title" w:type="paragraph">
     <w:name w:val="Title"/>
@@ -767,15 +829,18 @@
     <w:qFormat/>
     <w:rsid w:val="00A10FD9"/>
     <w:pPr>
-      <w:spacing w:after="80" w:line="240" w:lineRule="auto"/>
+      <w:keepNext/>
+      <w:spacing w:after="40" w:before="0" w:line="252" w:lineRule="auto"/>
       <w:contextualSpacing/>
       <w:jc w:val="center"/>
     </w:pPr>
     <w:rPr>
-      <w:rFonts w:asciiTheme="majorHAnsi" w:cstheme="majorBidi" w:eastAsiaTheme="majorEastAsia" w:hAnsiTheme="majorHAnsi"/>
+      <w:rFonts w:ascii="Arial" w:hAnsi="Arial"/>
+      <w:b/>
+      <w:color w:val="000000"/>
       <w:spacing w:val="-10"/>
       <w:kern w:val="28"/>
-      <w:sz w:val="56"/>
+      <w:sz w:val="40"/>
       <w:szCs w:val="56"/>
     </w:rPr>
   </w:style>
@@ -786,7 +851,7 @@
     <w:uiPriority w:val="10"/>
     <w:rsid w:val="00A10FD9"/>
     <w:rPr>
-      <w:rFonts w:asciiTheme="majorHAnsi" w:cstheme="majorBidi" w:eastAsiaTheme="majorEastAsia" w:hAnsiTheme="majorHAnsi"/>
+      <w:rFonts w:ascii="Arial" w:hAnsi="Arial"/>
       <w:spacing w:val="-10"/>
       <w:kern w:val="28"/>
       <w:sz w:val="56"/>
@@ -805,11 +870,13 @@
       <w:numPr>
         <w:ilvl w:val="1"/>
       </w:numPr>
-    </w:pPr>
-    <w:rPr>
-      <w:rFonts w:cstheme="majorBidi" w:eastAsiaTheme="majorEastAsia"/>
+      <w:spacing w:after="40" w:before="0" w:line="252" w:lineRule="auto"/>
+    </w:pPr>
+    <w:rPr>
+      <w:rFonts w:ascii="Arial" w:hAnsi="Arial"/>
+      <w:color w:val="000000"/>
       <w:spacing w:val="15"/>
-      <w:sz w:val="28"/>
+      <w:sz w:val="20"/>
       <w:szCs w:val="28"/>
     </w:rPr>
   </w:style>
@@ -820,7 +887,7 @@
     <w:uiPriority w:val="11"/>
     <w:rsid w:val="00A10FD9"/>
     <w:rPr>
-      <w:rFonts w:cstheme="majorBidi" w:eastAsiaTheme="majorEastAsia"/>
+      <w:rFonts w:ascii="Arial" w:hAnsi="Arial"/>
       <w:color w:themeColor="text1" w:themeTint="A6" w:val="595959"/>
       <w:spacing w:val="15"/>
       <w:sz w:val="28"/>
@@ -834,8 +901,14 @@
     <w:pPr>
       <w:keepNext/>
       <w:keepLines/>
+      <w:spacing w:after="40" w:before="0" w:line="252" w:lineRule="auto"/>
       <w:jc w:val="center"/>
     </w:pPr>
+    <w:rPr>
+      <w:rFonts w:ascii="Arial" w:hAnsi="Arial"/>
+      <w:color w:val="000000"/>
+      <w:sz w:val="20"/>
+    </w:rPr>
   </w:style>
   <w:style w:styleId="Date" w:type="paragraph">
     <w:name w:val="Date"/>
@@ -844,8 +917,14 @@
     <w:pPr>
       <w:keepNext/>
       <w:keepLines/>
+      <w:spacing w:after="40" w:before="0" w:line="252" w:lineRule="auto"/>
       <w:jc w:val="center"/>
     </w:pPr>
+    <w:rPr>
+      <w:rFonts w:ascii="Arial" w:hAnsi="Arial"/>
+      <w:color w:val="000000"/>
+      <w:sz w:val="20"/>
+    </w:rPr>
   </w:style>
   <w:style w:customStyle="1" w:styleId="AbstractTitle" w:type="paragraph">
     <w:name w:val="Abstract Title"/>
@@ -855,11 +934,13 @@
     <w:pPr>
       <w:keepNext/>
       <w:keepLines/>
-      <w:spacing w:after="0" w:before="300"/>
+      <w:spacing w:after="40" w:before="0" w:line="252" w:lineRule="auto"/>
       <w:jc w:val="center"/>
     </w:pPr>
     <w:rPr>
+      <w:rFonts w:ascii="Arial" w:hAnsi="Arial"/>
       <w:b/>
+      <w:color w:val="000000"/>
       <w:sz w:val="20"/>
       <w:szCs w:val="20"/>
     </w:rPr>
@@ -872,9 +953,11 @@
     <w:pPr>
       <w:keepNext/>
       <w:keepLines/>
-      <w:spacing w:after="300" w:before="100"/>
-    </w:pPr>
-    <w:rPr>
+      <w:spacing w:after="40" w:before="0" w:line="252" w:lineRule="auto"/>
+    </w:pPr>
+    <w:rPr>
+      <w:rFonts w:ascii="Arial" w:hAnsi="Arial"/>
+      <w:color w:val="000000"/>
       <w:sz w:val="20"/>
       <w:szCs w:val="20"/>
     </w:rPr>
@@ -884,8 +967,14 @@
     <w:basedOn w:val="Normal"/>
     <w:next w:val="Bibliography"/>
     <w:qFormat/>
-    <w:pPr/>
-    <w:rPr/>
+    <w:pPr>
+      <w:spacing w:after="40" w:before="0" w:line="252" w:lineRule="auto"/>
+    </w:pPr>
+    <w:rPr>
+      <w:rFonts w:ascii="Arial" w:hAnsi="Arial"/>
+      <w:color w:val="000000"/>
+      <w:sz w:val="20"/>
+    </w:rPr>
   </w:style>
   <w:style w:styleId="Heading1" w:type="paragraph">
     <w:name w:val="heading 1"/>
@@ -898,12 +987,13 @@
     <w:pPr>
       <w:keepNext/>
       <w:keepLines/>
-      <w:spacing w:after="80" w:before="360"/>
+      <w:spacing w:after="40" w:before="0" w:line="252" w:lineRule="auto"/>
       <w:outlineLvl w:val="0"/>
     </w:pPr>
     <w:rPr>
-      <w:rFonts w:asciiTheme="majorHAnsi" w:cstheme="majorBidi" w:eastAsiaTheme="majorEastAsia" w:hAnsiTheme="majorHAnsi"/>
-      <w:color w:themeColor="accent1" w:themeShade="BF" w:val="0F4761"/>
+      <w:rFonts w:ascii="Arial" w:hAnsi="Arial"/>
+      <w:b/>
+      <w:color w:val="000000"/>
       <w:sz w:val="40"/>
       <w:szCs w:val="40"/>
     </w:rPr>
@@ -921,13 +1011,14 @@
     <w:pPr>
       <w:keepNext/>
       <w:keepLines/>
-      <w:spacing w:after="80" w:before="160"/>
+      <w:spacing w:after="40" w:before="120" w:line="252" w:lineRule="auto"/>
       <w:outlineLvl w:val="1"/>
     </w:pPr>
     <w:rPr>
-      <w:rFonts w:asciiTheme="majorHAnsi" w:cstheme="majorBidi" w:eastAsiaTheme="majorEastAsia" w:hAnsiTheme="majorHAnsi"/>
-      <w:color w:themeColor="accent1" w:themeShade="BF" w:val="0F4761"/>
-      <w:sz w:val="32"/>
+      <w:rFonts w:ascii="Arial" w:hAnsi="Arial"/>
+      <w:b/>
+      <w:color w:val="000000"/>
+      <w:sz w:val="22"/>
       <w:szCs w:val="32"/>
     </w:rPr>
   </w:style>
@@ -944,13 +1035,14 @@
     <w:pPr>
       <w:keepNext/>
       <w:keepLines/>
-      <w:spacing w:after="80" w:before="160"/>
+      <w:spacing w:after="20" w:before="80" w:line="252" w:lineRule="auto"/>
       <w:outlineLvl w:val="2"/>
     </w:pPr>
     <w:rPr>
-      <w:rFonts w:cstheme="majorBidi" w:eastAsiaTheme="majorEastAsia"/>
-      <w:color w:themeColor="accent1" w:themeShade="BF" w:val="0F4761"/>
-      <w:sz w:val="28"/>
+      <w:rFonts w:ascii="Arial" w:hAnsi="Arial"/>
+      <w:b/>
+      <w:color w:val="000000"/>
+      <w:sz w:val="20"/>
       <w:szCs w:val="28"/>
     </w:rPr>
   </w:style>
@@ -967,14 +1059,15 @@
     <w:pPr>
       <w:keepNext/>
       <w:keepLines/>
-      <w:spacing w:after="40" w:before="80"/>
+      <w:spacing w:after="40" w:before="0" w:line="252" w:lineRule="auto"/>
       <w:outlineLvl w:val="3"/>
     </w:pPr>
     <w:rPr>
-      <w:rFonts w:cstheme="majorBidi" w:eastAsiaTheme="majorEastAsia"/>
+      <w:rFonts w:ascii="Arial" w:hAnsi="Arial"/>
       <w:i/>
       <w:iCs/>
-      <w:color w:themeColor="accent1" w:themeShade="BF" w:val="0F4761"/>
+      <w:color w:val="000000"/>
+      <w:sz w:val="20"/>
     </w:rPr>
   </w:style>
   <w:style w:styleId="Heading5" w:type="paragraph">
@@ -990,12 +1083,13 @@
     <w:pPr>
       <w:keepNext/>
       <w:keepLines/>
-      <w:spacing w:after="40" w:before="80"/>
+      <w:spacing w:after="40" w:before="0" w:line="252" w:lineRule="auto"/>
       <w:outlineLvl w:val="4"/>
     </w:pPr>
     <w:rPr>
-      <w:rFonts w:cstheme="majorBidi" w:eastAsiaTheme="majorEastAsia"/>
-      <w:color w:themeColor="accent1" w:themeShade="BF" w:val="0F4761"/>
+      <w:rFonts w:ascii="Arial" w:hAnsi="Arial"/>
+      <w:color w:val="000000"/>
+      <w:sz w:val="20"/>
     </w:rPr>
   </w:style>
   <w:style w:styleId="Heading6" w:type="paragraph">
@@ -1011,14 +1105,15 @@
     <w:pPr>
       <w:keepNext/>
       <w:keepLines/>
-      <w:spacing w:after="0" w:before="40"/>
+      <w:spacing w:after="40" w:before="0" w:line="252" w:lineRule="auto"/>
       <w:outlineLvl w:val="5"/>
     </w:pPr>
     <w:rPr>
-      <w:rFonts w:cstheme="majorBidi" w:eastAsiaTheme="majorEastAsia"/>
+      <w:rFonts w:ascii="Arial" w:hAnsi="Arial"/>
       <w:i/>
       <w:iCs/>
-      <w:color w:themeColor="text1" w:themeTint="A6" w:val="595959"/>
+      <w:color w:val="000000"/>
+      <w:sz w:val="20"/>
     </w:rPr>
   </w:style>
   <w:style w:styleId="Heading7" w:type="paragraph">
@@ -1034,12 +1129,13 @@
     <w:pPr>
       <w:keepNext/>
       <w:keepLines/>
-      <w:spacing w:after="0" w:before="40"/>
+      <w:spacing w:after="40" w:before="0" w:line="252" w:lineRule="auto"/>
       <w:outlineLvl w:val="6"/>
     </w:pPr>
     <w:rPr>
-      <w:rFonts w:cstheme="majorBidi" w:eastAsiaTheme="majorEastAsia"/>
-      <w:color w:themeColor="text1" w:themeTint="A6" w:val="595959"/>
+      <w:rFonts w:ascii="Arial" w:hAnsi="Arial"/>
+      <w:color w:val="000000"/>
+      <w:sz w:val="20"/>
     </w:rPr>
   </w:style>
   <w:style w:styleId="Heading8" w:type="paragraph">
@@ -1055,14 +1151,15 @@
     <w:pPr>
       <w:keepNext/>
       <w:keepLines/>
-      <w:spacing w:after="0"/>
+      <w:spacing w:after="40" w:before="0" w:line="252" w:lineRule="auto"/>
       <w:outlineLvl w:val="7"/>
     </w:pPr>
     <w:rPr>
-      <w:rFonts w:cstheme="majorBidi" w:eastAsiaTheme="majorEastAsia"/>
+      <w:rFonts w:ascii="Arial" w:hAnsi="Arial"/>
       <w:i/>
       <w:iCs/>
-      <w:color w:themeColor="text1" w:themeTint="D8" w:val="272727"/>
+      <w:color w:val="000000"/>
+      <w:sz w:val="20"/>
     </w:rPr>
   </w:style>
   <w:style w:styleId="Heading9" w:type="paragraph">
@@ -1078,12 +1175,13 @@
     <w:pPr>
       <w:keepNext/>
       <w:keepLines/>
-      <w:spacing w:after="0"/>
+      <w:spacing w:after="40" w:before="0" w:line="252" w:lineRule="auto"/>
       <w:outlineLvl w:val="8"/>
     </w:pPr>
     <w:rPr>
-      <w:rFonts w:cstheme="majorBidi" w:eastAsiaTheme="majorEastAsia"/>
-      <w:color w:themeColor="text1" w:themeTint="D8" w:val="272727"/>
+      <w:rFonts w:ascii="Arial" w:hAnsi="Arial"/>
+      <w:color w:val="000000"/>
+      <w:sz w:val="20"/>
     </w:rPr>
   </w:style>
   <w:style w:customStyle="1" w:styleId="Heading1Char" w:type="character">
@@ -1093,7 +1191,7 @@
     <w:uiPriority w:val="9"/>
     <w:rsid w:val="00A10FD9"/>
     <w:rPr>
-      <w:rFonts w:asciiTheme="majorHAnsi" w:cstheme="majorBidi" w:eastAsiaTheme="majorEastAsia" w:hAnsiTheme="majorHAnsi"/>
+      <w:rFonts w:ascii="Arial" w:hAnsi="Arial"/>
       <w:color w:themeColor="accent1" w:themeShade="BF" w:val="0F4761"/>
       <w:sz w:val="40"/>
       <w:szCs w:val="40"/>
@@ -1107,7 +1205,7 @@
     <w:semiHidden/>
     <w:rsid w:val="00A10FD9"/>
     <w:rPr>
-      <w:rFonts w:asciiTheme="majorHAnsi" w:cstheme="majorBidi" w:eastAsiaTheme="majorEastAsia" w:hAnsiTheme="majorHAnsi"/>
+      <w:rFonts w:ascii="Arial" w:hAnsi="Arial"/>
       <w:color w:themeColor="accent1" w:themeShade="BF" w:val="0F4761"/>
       <w:sz w:val="32"/>
       <w:szCs w:val="32"/>
@@ -1121,7 +1219,7 @@
     <w:semiHidden/>
     <w:rsid w:val="00A10FD9"/>
     <w:rPr>
-      <w:rFonts w:cstheme="majorBidi" w:eastAsiaTheme="majorEastAsia"/>
+      <w:rFonts w:ascii="Arial" w:hAnsi="Arial"/>
       <w:color w:themeColor="accent1" w:themeShade="BF" w:val="0F4761"/>
       <w:sz w:val="28"/>
       <w:szCs w:val="28"/>
@@ -1135,7 +1233,7 @@
     <w:semiHidden/>
     <w:rsid w:val="00A10FD9"/>
     <w:rPr>
-      <w:rFonts w:cstheme="majorBidi" w:eastAsiaTheme="majorEastAsia"/>
+      <w:rFonts w:ascii="Arial" w:hAnsi="Arial"/>
       <w:i/>
       <w:iCs/>
       <w:color w:themeColor="accent1" w:themeShade="BF" w:val="0F4761"/>
@@ -1149,7 +1247,7 @@
     <w:semiHidden/>
     <w:rsid w:val="00A10FD9"/>
     <w:rPr>
-      <w:rFonts w:cstheme="majorBidi" w:eastAsiaTheme="majorEastAsia"/>
+      <w:rFonts w:ascii="Arial" w:hAnsi="Arial"/>
       <w:color w:themeColor="accent1" w:themeShade="BF" w:val="0F4761"/>
     </w:rPr>
   </w:style>
@@ -1161,7 +1259,7 @@
     <w:semiHidden/>
     <w:rsid w:val="00A10FD9"/>
     <w:rPr>
-      <w:rFonts w:cstheme="majorBidi" w:eastAsiaTheme="majorEastAsia"/>
+      <w:rFonts w:ascii="Arial" w:hAnsi="Arial"/>
       <w:i/>
       <w:iCs/>
       <w:color w:themeColor="text1" w:themeTint="A6" w:val="595959"/>
@@ -1175,7 +1273,7 @@
     <w:semiHidden/>
     <w:rsid w:val="00A10FD9"/>
     <w:rPr>
-      <w:rFonts w:cstheme="majorBidi" w:eastAsiaTheme="majorEastAsia"/>
+      <w:rFonts w:ascii="Arial" w:hAnsi="Arial"/>
       <w:color w:themeColor="text1" w:themeTint="A6" w:val="595959"/>
     </w:rPr>
   </w:style>
@@ -1187,7 +1285,7 @@
     <w:semiHidden/>
     <w:rsid w:val="00A10FD9"/>
     <w:rPr>
-      <w:rFonts w:cstheme="majorBidi" w:eastAsiaTheme="majorEastAsia"/>
+      <w:rFonts w:ascii="Arial" w:hAnsi="Arial"/>
       <w:i/>
       <w:iCs/>
       <w:color w:themeColor="text1" w:themeTint="D8" w:val="272727"/>
@@ -1201,7 +1299,7 @@
     <w:semiHidden/>
     <w:rsid w:val="00A10FD9"/>
     <w:rPr>
-      <w:rFonts w:cstheme="majorBidi" w:eastAsiaTheme="majorEastAsia"/>
+      <w:rFonts w:ascii="Arial" w:hAnsi="Arial"/>
       <w:color w:themeColor="text1" w:themeTint="D8" w:val="272727"/>
     </w:rPr>
   </w:style>
@@ -1213,9 +1311,14 @@
     <w:unhideWhenUsed/>
     <w:qFormat/>
     <w:pPr>
-      <w:spacing w:after="100" w:before="100"/>
+      <w:spacing w:after="40" w:before="0" w:line="252" w:lineRule="auto"/>
       <w:ind w:firstLine="0" w:left="480" w:right="480"/>
     </w:pPr>
+    <w:rPr>
+      <w:rFonts w:ascii="Arial" w:hAnsi="Arial"/>
+      <w:color w:val="000000"/>
+      <w:sz w:val="20"/>
+    </w:rPr>
   </w:style>
   <w:style w:styleId="FootnoteText" w:type="paragraph">
     <w:name w:val="Footnote Text"/>
@@ -1224,6 +1327,14 @@
     <w:uiPriority w:val="9"/>
     <w:unhideWhenUsed/>
     <w:qFormat/>
+    <w:pPr>
+      <w:spacing w:after="40" w:before="0" w:line="252" w:lineRule="auto"/>
+    </w:pPr>
+    <w:rPr>
+      <w:rFonts w:ascii="Arial" w:hAnsi="Arial"/>
+      <w:color w:val="000000"/>
+      <w:sz w:val="20"/>
+    </w:rPr>
   </w:style>
   <w:style w:styleId="FootnoteBlockText" w:type="paragraph">
     <w:name w:val="Footnote Block Text"/>
@@ -1233,14 +1344,22 @@
     <w:unhideWhenUsed/>
     <w:qFormat/>
     <w:pPr>
-      <w:spacing w:after="100" w:before="100"/>
+      <w:spacing w:after="40" w:before="0" w:line="252" w:lineRule="auto"/>
       <w:ind w:firstLine="0" w:left="480" w:right="480"/>
     </w:pPr>
+    <w:rPr>
+      <w:rFonts w:ascii="Arial" w:hAnsi="Arial"/>
+      <w:color w:val="000000"/>
+      <w:sz w:val="20"/>
+    </w:rPr>
   </w:style>
   <w:style w:default="1" w:styleId="DefaultParagraphFont" w:type="character">
     <w:name w:val="Default Paragraph Font"/>
     <w:semiHidden/>
     <w:unhideWhenUsed/>
+    <w:rPr>
+      <w:rFonts w:ascii="Arial" w:hAnsi="Arial"/>
+    </w:rPr>
   </w:style>
   <w:style w:default="1" w:styleId="Table" w:type="table">
     <w:name w:val="Table"/>
@@ -1248,6 +1367,9 @@
     <w:semiHidden/>
     <w:unhideWhenUsed/>
     <w:qFormat/>
+    <w:rPr>
+      <w:rFonts w:ascii="Arial" w:hAnsi="Arial"/>
+    </w:rPr>
     <w:tblPr>
       <w:tblInd w:type="dxa" w:w="0"/>
       <w:tblCellMar>
@@ -1280,25 +1402,39 @@
     <w:pPr>
       <w:keepNext/>
       <w:keepLines/>
-      <w:spacing w:after="0"/>
-    </w:pPr>
-    <w:rPr>
+      <w:spacing w:after="40" w:before="0" w:line="252" w:lineRule="auto"/>
+    </w:pPr>
+    <w:rPr>
+      <w:rFonts w:ascii="Arial" w:hAnsi="Arial"/>
       <w:b/>
+      <w:color w:val="000000"/>
+      <w:sz w:val="20"/>
     </w:rPr>
   </w:style>
   <w:style w:customStyle="1" w:styleId="Definition" w:type="paragraph">
     <w:name w:val="Definition"/>
     <w:basedOn w:val="Normal"/>
+    <w:pPr>
+      <w:spacing w:after="40" w:before="0" w:line="252" w:lineRule="auto"/>
+    </w:pPr>
+    <w:rPr>
+      <w:rFonts w:ascii="Arial" w:hAnsi="Arial"/>
+      <w:color w:val="000000"/>
+      <w:sz w:val="20"/>
+    </w:rPr>
   </w:style>
   <w:style w:styleId="Caption" w:type="paragraph">
     <w:name w:val="Caption"/>
     <w:basedOn w:val="Normal"/>
     <w:link w:val="BodyTextChar"/>
     <w:pPr>
-      <w:spacing w:after="120" w:before="0"/>
-    </w:pPr>
-    <w:rPr>
+      <w:spacing w:after="40" w:before="0" w:line="252" w:lineRule="auto"/>
+    </w:pPr>
+    <w:rPr>
+      <w:rFonts w:ascii="Arial" w:hAnsi="Arial"/>
       <w:i/>
+      <w:color w:val="000000"/>
+      <w:sz w:val="20"/>
     </w:rPr>
   </w:style>
   <w:style w:customStyle="1" w:styleId="TableCaption" w:type="paragraph">
@@ -1306,44 +1442,79 @@
     <w:basedOn w:val="Caption"/>
     <w:pPr>
       <w:keepNext/>
-    </w:pPr>
+      <w:spacing w:after="40" w:before="0" w:line="252" w:lineRule="auto"/>
+    </w:pPr>
+    <w:rPr>
+      <w:rFonts w:ascii="Arial" w:hAnsi="Arial"/>
+      <w:color w:val="000000"/>
+      <w:sz w:val="20"/>
+    </w:rPr>
   </w:style>
   <w:style w:customStyle="1" w:styleId="ImageCaption" w:type="paragraph">
     <w:name w:val="Image Caption"/>
     <w:basedOn w:val="Caption"/>
+    <w:pPr>
+      <w:spacing w:after="40" w:before="0" w:line="252" w:lineRule="auto"/>
+    </w:pPr>
+    <w:rPr>
+      <w:rFonts w:ascii="Arial" w:hAnsi="Arial"/>
+      <w:color w:val="000000"/>
+      <w:sz w:val="20"/>
+    </w:rPr>
   </w:style>
   <w:style w:customStyle="1" w:styleId="Figure" w:type="paragraph">
     <w:name w:val="Figure"/>
     <w:basedOn w:val="Normal"/>
+    <w:pPr>
+      <w:spacing w:after="40" w:before="0" w:line="252" w:lineRule="auto"/>
+    </w:pPr>
+    <w:rPr>
+      <w:rFonts w:ascii="Arial" w:hAnsi="Arial"/>
+      <w:color w:val="000000"/>
+      <w:sz w:val="20"/>
+    </w:rPr>
   </w:style>
   <w:style w:customStyle="1" w:styleId="CaptionedFigure" w:type="paragraph">
     <w:name w:val="Captioned Figure"/>
     <w:basedOn w:val="Figure"/>
     <w:pPr>
       <w:keepNext/>
-    </w:pPr>
+      <w:spacing w:after="40" w:before="0" w:line="252" w:lineRule="auto"/>
+    </w:pPr>
+    <w:rPr>
+      <w:rFonts w:ascii="Arial" w:hAnsi="Arial"/>
+      <w:color w:val="000000"/>
+      <w:sz w:val="20"/>
+    </w:rPr>
   </w:style>
   <w:style w:customStyle="1" w:styleId="BodyTextChar" w:type="character">
     <w:name w:val="Body Text Char"/>
     <w:basedOn w:val="DefaultParagraphFont"/>
     <w:link w:val="BodyText"/>
+    <w:rPr>
+      <w:rFonts w:ascii="Arial" w:hAnsi="Arial"/>
+    </w:rPr>
   </w:style>
   <w:style w:customStyle="1" w:styleId="VerbatimChar" w:type="character">
     <w:name w:val="Verbatim Char"/>
     <w:basedOn w:val="BodyTextChar"/>
     <w:rPr>
-      <w:rFonts w:ascii="Consolas" w:hAnsi="Consolas"/>
+      <w:rFonts w:ascii="Arial" w:hAnsi="Arial"/>
       <w:sz w:val="22"/>
     </w:rPr>
   </w:style>
   <w:style w:customStyle="1" w:styleId="SectionNumber" w:type="character">
     <w:name w:val="Section Number"/>
     <w:basedOn w:val="BodyTextChar"/>
+    <w:rPr>
+      <w:rFonts w:ascii="Arial" w:hAnsi="Arial"/>
+    </w:rPr>
   </w:style>
   <w:style w:styleId="FootnoteReference" w:type="character">
     <w:name w:val="Footnote Reference"/>
     <w:basedOn w:val="BodyTextChar"/>
     <w:rPr>
+      <w:rFonts w:ascii="Arial" w:hAnsi="Arial"/>
       <w:vertAlign w:val="superscript"/>
     </w:rPr>
   </w:style>
@@ -1351,6 +1522,7 @@
     <w:name w:val="Hyperlink"/>
     <w:basedOn w:val="BodyTextChar"/>
     <w:rPr>
+      <w:rFonts w:ascii="Arial" w:hAnsi="Arial"/>
       <w:color w:themeColor="accent1" w:val="4F81BD"/>
     </w:rPr>
   </w:style>
@@ -1362,249 +1534,290 @@
     <w:unhideWhenUsed/>
     <w:qFormat/>
     <w:pPr>
-      <w:spacing w:before="240" w:line="259" w:lineRule="auto"/>
+      <w:spacing w:after="40" w:before="0" w:line="252" w:lineRule="auto"/>
       <w:outlineLvl w:val="9"/>
     </w:pPr>
     <w:rPr>
-      <w:rFonts w:asciiTheme="majorHAnsi" w:cstheme="majorBidi" w:eastAsiaTheme="majorEastAsia" w:hAnsiTheme="majorHAnsi"/>
+      <w:rFonts w:ascii="Arial" w:hAnsi="Arial"/>
       <w:b w:val="0"/>
       <w:bCs w:val="0"/>
-      <w:color w:themeColor="accent1" w:themeShade="BF" w:val="365F91"/>
-    </w:rPr>
-  </w:style>
-  <w:style w:type="paragraph" w:customStyle="1" w:styleId="SourceCode">
+      <w:color w:val="000000"/>
+      <w:sz w:val="20"/>
+    </w:rPr>
+  </w:style>
+  <w:style w:customStyle="1" w:styleId="SourceCode" w:type="paragraph">
     <w:name w:val="Source Code"/>
     <w:basedOn w:val="Normal"/>
     <w:link w:val="VerbatimChar"/>
     <w:pPr>
       <w:wordWrap w:val="off"/>
-    </w:pPr>
-  </w:style>
-  <w:style w:type="character" w:customStyle="1" w:styleId="KeywordTok">
+      <w:spacing w:after="40" w:before="0" w:line="252" w:lineRule="auto"/>
+    </w:pPr>
+    <w:rPr>
+      <w:rFonts w:ascii="Arial" w:hAnsi="Arial"/>
+      <w:color w:val="000000"/>
+      <w:sz w:val="20"/>
+    </w:rPr>
+  </w:style>
+  <w:style w:customStyle="1" w:styleId="KeywordTok" w:type="character">
     <w:name w:val="KeywordTok"/>
     <w:basedOn w:val="VerbatimChar"/>
     <w:rPr>
+      <w:rFonts w:ascii="Arial" w:hAnsi="Arial"/>
       <w:b/>
       <w:color w:val="007020"/>
     </w:rPr>
   </w:style>
-  <w:style w:type="character" w:customStyle="1" w:styleId="DataTypeTok">
+  <w:style w:customStyle="1" w:styleId="DataTypeTok" w:type="character">
     <w:name w:val="DataTypeTok"/>
     <w:basedOn w:val="VerbatimChar"/>
     <w:rPr>
+      <w:rFonts w:ascii="Arial" w:hAnsi="Arial"/>
       <w:color w:val="902000"/>
     </w:rPr>
   </w:style>
-  <w:style w:type="character" w:customStyle="1" w:styleId="DecValTok">
+  <w:style w:customStyle="1" w:styleId="DecValTok" w:type="character">
     <w:name w:val="DecValTok"/>
     <w:basedOn w:val="VerbatimChar"/>
     <w:rPr>
+      <w:rFonts w:ascii="Arial" w:hAnsi="Arial"/>
       <w:color w:val="40a070"/>
     </w:rPr>
   </w:style>
-  <w:style w:type="character" w:customStyle="1" w:styleId="BaseNTok">
+  <w:style w:customStyle="1" w:styleId="BaseNTok" w:type="character">
     <w:name w:val="BaseNTok"/>
     <w:basedOn w:val="VerbatimChar"/>
     <w:rPr>
+      <w:rFonts w:ascii="Arial" w:hAnsi="Arial"/>
       <w:color w:val="40a070"/>
     </w:rPr>
   </w:style>
-  <w:style w:type="character" w:customStyle="1" w:styleId="FloatTok">
+  <w:style w:customStyle="1" w:styleId="FloatTok" w:type="character">
     <w:name w:val="FloatTok"/>
     <w:basedOn w:val="VerbatimChar"/>
     <w:rPr>
+      <w:rFonts w:ascii="Arial" w:hAnsi="Arial"/>
       <w:color w:val="40a070"/>
     </w:rPr>
   </w:style>
-  <w:style w:type="character" w:customStyle="1" w:styleId="ConstantTok">
+  <w:style w:customStyle="1" w:styleId="ConstantTok" w:type="character">
     <w:name w:val="ConstantTok"/>
     <w:basedOn w:val="VerbatimChar"/>
     <w:rPr>
+      <w:rFonts w:ascii="Arial" w:hAnsi="Arial"/>
       <w:color w:val="880000"/>
     </w:rPr>
   </w:style>
-  <w:style w:type="character" w:customStyle="1" w:styleId="CharTok">
+  <w:style w:customStyle="1" w:styleId="CharTok" w:type="character">
     <w:name w:val="CharTok"/>
     <w:basedOn w:val="VerbatimChar"/>
     <w:rPr>
+      <w:rFonts w:ascii="Arial" w:hAnsi="Arial"/>
       <w:color w:val="4070a0"/>
     </w:rPr>
   </w:style>
-  <w:style w:type="character" w:customStyle="1" w:styleId="SpecialCharTok">
+  <w:style w:customStyle="1" w:styleId="SpecialCharTok" w:type="character">
     <w:name w:val="SpecialCharTok"/>
     <w:basedOn w:val="VerbatimChar"/>
     <w:rPr>
+      <w:rFonts w:ascii="Arial" w:hAnsi="Arial"/>
       <w:color w:val="4070a0"/>
     </w:rPr>
   </w:style>
-  <w:style w:type="character" w:customStyle="1" w:styleId="StringTok">
+  <w:style w:customStyle="1" w:styleId="StringTok" w:type="character">
     <w:name w:val="StringTok"/>
     <w:basedOn w:val="VerbatimChar"/>
     <w:rPr>
+      <w:rFonts w:ascii="Arial" w:hAnsi="Arial"/>
       <w:color w:val="4070a0"/>
     </w:rPr>
   </w:style>
-  <w:style w:type="character" w:customStyle="1" w:styleId="VerbatimStringTok">
+  <w:style w:customStyle="1" w:styleId="VerbatimStringTok" w:type="character">
     <w:name w:val="VerbatimStringTok"/>
     <w:basedOn w:val="VerbatimChar"/>
     <w:rPr>
+      <w:rFonts w:ascii="Arial" w:hAnsi="Arial"/>
       <w:color w:val="4070a0"/>
     </w:rPr>
   </w:style>
-  <w:style w:type="character" w:customStyle="1" w:styleId="SpecialStringTok">
+  <w:style w:customStyle="1" w:styleId="SpecialStringTok" w:type="character">
     <w:name w:val="SpecialStringTok"/>
     <w:basedOn w:val="VerbatimChar"/>
     <w:rPr>
+      <w:rFonts w:ascii="Arial" w:hAnsi="Arial"/>
       <w:color w:val="bb6688"/>
     </w:rPr>
   </w:style>
-  <w:style w:type="character" w:customStyle="1" w:styleId="ImportTok">
+  <w:style w:customStyle="1" w:styleId="ImportTok" w:type="character">
     <w:name w:val="ImportTok"/>
     <w:basedOn w:val="VerbatimChar"/>
     <w:rPr>
+      <w:rFonts w:ascii="Arial" w:hAnsi="Arial"/>
       <w:b/>
       <w:color w:val="008000"/>
     </w:rPr>
   </w:style>
-  <w:style w:type="character" w:customStyle="1" w:styleId="CommentTok">
+  <w:style w:customStyle="1" w:styleId="CommentTok" w:type="character">
     <w:name w:val="CommentTok"/>
     <w:basedOn w:val="VerbatimChar"/>
     <w:rPr>
+      <w:rFonts w:ascii="Arial" w:hAnsi="Arial"/>
       <w:i/>
       <w:color w:val="60a0b0"/>
     </w:rPr>
   </w:style>
-  <w:style w:type="character" w:customStyle="1" w:styleId="DocumentationTok">
+  <w:style w:customStyle="1" w:styleId="DocumentationTok" w:type="character">
     <w:name w:val="DocumentationTok"/>
     <w:basedOn w:val="VerbatimChar"/>
     <w:rPr>
+      <w:rFonts w:ascii="Arial" w:hAnsi="Arial"/>
       <w:i/>
       <w:color w:val="ba2121"/>
     </w:rPr>
   </w:style>
-  <w:style w:type="character" w:customStyle="1" w:styleId="AnnotationTok">
+  <w:style w:customStyle="1" w:styleId="AnnotationTok" w:type="character">
     <w:name w:val="AnnotationTok"/>
     <w:basedOn w:val="VerbatimChar"/>
     <w:rPr>
+      <w:rFonts w:ascii="Arial" w:hAnsi="Arial"/>
       <w:b/>
       <w:i/>
       <w:color w:val="60a0b0"/>
     </w:rPr>
   </w:style>
-  <w:style w:type="character" w:customStyle="1" w:styleId="CommentVarTok">
+  <w:style w:customStyle="1" w:styleId="CommentVarTok" w:type="character">
     <w:name w:val="CommentVarTok"/>
     <w:basedOn w:val="VerbatimChar"/>
     <w:rPr>
+      <w:rFonts w:ascii="Arial" w:hAnsi="Arial"/>
       <w:b/>
       <w:i/>
       <w:color w:val="60a0b0"/>
     </w:rPr>
   </w:style>
-  <w:style w:type="character" w:customStyle="1" w:styleId="OtherTok">
+  <w:style w:customStyle="1" w:styleId="OtherTok" w:type="character">
     <w:name w:val="OtherTok"/>
     <w:basedOn w:val="VerbatimChar"/>
     <w:rPr>
+      <w:rFonts w:ascii="Arial" w:hAnsi="Arial"/>
       <w:color w:val="007020"/>
     </w:rPr>
   </w:style>
-  <w:style w:type="character" w:customStyle="1" w:styleId="FunctionTok">
+  <w:style w:customStyle="1" w:styleId="FunctionTok" w:type="character">
     <w:name w:val="FunctionTok"/>
     <w:basedOn w:val="VerbatimChar"/>
     <w:rPr>
+      <w:rFonts w:ascii="Arial" w:hAnsi="Arial"/>
       <w:color w:val="06287e"/>
     </w:rPr>
   </w:style>
-  <w:style w:type="character" w:customStyle="1" w:styleId="VariableTok">
+  <w:style w:customStyle="1" w:styleId="VariableTok" w:type="character">
     <w:name w:val="VariableTok"/>
     <w:basedOn w:val="VerbatimChar"/>
     <w:rPr>
+      <w:rFonts w:ascii="Arial" w:hAnsi="Arial"/>
       <w:color w:val="19177c"/>
     </w:rPr>
   </w:style>
-  <w:style w:type="character" w:customStyle="1" w:styleId="ControlFlowTok">
+  <w:style w:customStyle="1" w:styleId="ControlFlowTok" w:type="character">
     <w:name w:val="ControlFlowTok"/>
     <w:basedOn w:val="VerbatimChar"/>
     <w:rPr>
+      <w:rFonts w:ascii="Arial" w:hAnsi="Arial"/>
       <w:b/>
       <w:color w:val="007020"/>
     </w:rPr>
   </w:style>
-  <w:style w:type="character" w:customStyle="1" w:styleId="OperatorTok">
+  <w:style w:customStyle="1" w:styleId="OperatorTok" w:type="character">
     <w:name w:val="OperatorTok"/>
     <w:basedOn w:val="VerbatimChar"/>
     <w:rPr>
+      <w:rFonts w:ascii="Arial" w:hAnsi="Arial"/>
       <w:color w:val="666666"/>
     </w:rPr>
   </w:style>
-  <w:style w:type="character" w:customStyle="1" w:styleId="BuiltInTok">
+  <w:style w:customStyle="1" w:styleId="BuiltInTok" w:type="character">
     <w:name w:val="BuiltInTok"/>
     <w:basedOn w:val="VerbatimChar"/>
     <w:rPr>
+      <w:rFonts w:ascii="Arial" w:hAnsi="Arial"/>
       <w:color w:val="008000"/>
     </w:rPr>
   </w:style>
-  <w:style w:type="character" w:customStyle="1" w:styleId="ExtensionTok">
+  <w:style w:customStyle="1" w:styleId="ExtensionTok" w:type="character">
     <w:name w:val="ExtensionTok"/>
     <w:basedOn w:val="VerbatimChar"/>
-    <w:rPr/>
-  </w:style>
-  <w:style w:type="character" w:customStyle="1" w:styleId="PreprocessorTok">
+    <w:rPr>
+      <w:rFonts w:ascii="Arial" w:hAnsi="Arial"/>
+    </w:rPr>
+  </w:style>
+  <w:style w:customStyle="1" w:styleId="PreprocessorTok" w:type="character">
     <w:name w:val="PreprocessorTok"/>
     <w:basedOn w:val="VerbatimChar"/>
     <w:rPr>
+      <w:rFonts w:ascii="Arial" w:hAnsi="Arial"/>
       <w:color w:val="bc7a00"/>
     </w:rPr>
   </w:style>
-  <w:style w:type="character" w:customStyle="1" w:styleId="AttributeTok">
+  <w:style w:customStyle="1" w:styleId="AttributeTok" w:type="character">
     <w:name w:val="AttributeTok"/>
     <w:basedOn w:val="VerbatimChar"/>
     <w:rPr>
+      <w:rFonts w:ascii="Arial" w:hAnsi="Arial"/>
       <w:color w:val="7d9029"/>
     </w:rPr>
   </w:style>
-  <w:style w:type="character" w:customStyle="1" w:styleId="RegionMarkerTok">
+  <w:style w:customStyle="1" w:styleId="RegionMarkerTok" w:type="character">
     <w:name w:val="RegionMarkerTok"/>
     <w:basedOn w:val="VerbatimChar"/>
-    <w:rPr/>
-  </w:style>
-  <w:style w:type="character" w:customStyle="1" w:styleId="InformationTok">
+    <w:rPr>
+      <w:rFonts w:ascii="Arial" w:hAnsi="Arial"/>
+    </w:rPr>
+  </w:style>
+  <w:style w:customStyle="1" w:styleId="InformationTok" w:type="character">
     <w:name w:val="InformationTok"/>
     <w:basedOn w:val="VerbatimChar"/>
     <w:rPr>
+      <w:rFonts w:ascii="Arial" w:hAnsi="Arial"/>
       <w:b/>
       <w:i/>
       <w:color w:val="60a0b0"/>
     </w:rPr>
   </w:style>
-  <w:style w:type="character" w:customStyle="1" w:styleId="WarningTok">
+  <w:style w:customStyle="1" w:styleId="WarningTok" w:type="character">
     <w:name w:val="WarningTok"/>
     <w:basedOn w:val="VerbatimChar"/>
     <w:rPr>
+      <w:rFonts w:ascii="Arial" w:hAnsi="Arial"/>
       <w:b/>
       <w:i/>
       <w:color w:val="60a0b0"/>
     </w:rPr>
   </w:style>
-  <w:style w:type="character" w:customStyle="1" w:styleId="AlertTok">
+  <w:style w:customStyle="1" w:styleId="AlertTok" w:type="character">
     <w:name w:val="AlertTok"/>
     <w:basedOn w:val="VerbatimChar"/>
     <w:rPr>
+      <w:rFonts w:ascii="Arial" w:hAnsi="Arial"/>
       <w:b/>
       <w:color w:val="ff0000"/>
     </w:rPr>
   </w:style>
-  <w:style w:type="character" w:customStyle="1" w:styleId="ErrorTok">
+  <w:style w:customStyle="1" w:styleId="ErrorTok" w:type="character">
     <w:name w:val="ErrorTok"/>
     <w:basedOn w:val="VerbatimChar"/>
     <w:rPr>
+      <w:rFonts w:ascii="Arial" w:hAnsi="Arial"/>
       <w:b/>
       <w:color w:val="ff0000"/>
     </w:rPr>
   </w:style>
-  <w:style w:type="character" w:customStyle="1" w:styleId="NormalTok">
+  <w:style w:customStyle="1" w:styleId="NormalTok" w:type="character">
     <w:name w:val="NormalTok"/>
     <w:basedOn w:val="VerbatimChar"/>
-    <w:rPr/>
+    <w:rPr>
+      <w:rFonts w:ascii="Arial" w:hAnsi="Arial"/>
+    </w:rPr>
   </w:style>
 </w:styles>
 </file>

</xml_diff>

<commit_message>
Update resume contact details and US Europe availability
</commit_message>
<xml_diff>
--- a/resume.docx
+++ b/resume.docx
@@ -2,11 +2,10 @@
 <file path=word/document.xml><?xml version="1.0" encoding="utf-8"?>
 <w:document xmlns:w="http://schemas.openxmlformats.org/wordprocessingml/2006/main" xmlns:m="http://schemas.openxmlformats.org/officeDocument/2006/math" xmlns:r="http://schemas.openxmlformats.org/officeDocument/2006/relationships" xmlns:o="urn:schemas-microsoft-com:office:office" xmlns:v="urn:schemas-microsoft-com:vml" xmlns:w10="urn:schemas-microsoft-com:office:word" xmlns:a="http://schemas.openxmlformats.org/drawingml/2006/main" xmlns:pic="http://schemas.openxmlformats.org/drawingml/2006/picture" xmlns:wp="http://schemas.openxmlformats.org/drawingml/2006/wordprocessingDrawing">
   <w:body>
-    <w:bookmarkStart w:id="23" w:name="brian-merriman"/>
+    <w:bookmarkStart w:id="24" w:name="brian-merriman"/>
     <w:p>
       <w:pPr>
         <w:pStyle w:val="Title"/>
-        <w:jc w:val="left"/>
       </w:pPr>
       <w:r>
         <w:t xml:space="preserve">Brian Merriman</w:t>
@@ -15,7 +14,6 @@
     <w:p>
       <w:pPr>
         <w:pStyle w:val="FirstParagraph"/>
-        <w:jc w:val="left"/>
       </w:pPr>
       <w:r>
         <w:t xml:space="preserve">Senior Frontend Engineer | Frontend Software Engineer | Complex Data Applications</w:t>
@@ -24,10 +22,9 @@
     <w:p>
       <w:pPr>
         <w:pStyle w:val="BodyText"/>
-        <w:jc w:val="left"/>
-      </w:pPr>
-      <w:r>
-        <w:t xml:space="preserve">New York, NY |</w:t>
+      </w:pPr>
+      <w:r>
+        <w:t xml:space="preserve">White Plains, NY (NYC via Metro-North) |</w:t>
       </w:r>
       <w:r>
         <w:t xml:space="preserve"> </w:t>
@@ -37,7 +34,7 @@
           <w:rPr>
             <w:rStyle w:val="Hyperlink"/>
           </w:rPr>
-          <w:t xml:space="preserve">b@merriman.xyz</w:t>
+          <w:t xml:space="preserve">merriman.bt@gmail.com</w:t>
         </w:r>
       </w:hyperlink>
       <w:r>
@@ -50,6 +47,17 @@
         <w:t xml:space="preserve"> </w:t>
       </w:r>
       <w:hyperlink r:id="rId21">
+        <w:r>
+          <w:rPr>
+            <w:rStyle w:val="Hyperlink"/>
+          </w:rPr>
+          <w:t xml:space="preserve">914-888-6931</w:t>
+        </w:r>
+      </w:hyperlink>
+      <w:r>
+        <w:br/>
+      </w:r>
+      <w:hyperlink r:id="rId22">
         <w:r>
           <w:rPr>
             <w:rStyle w:val="Hyperlink"/>
@@ -66,7 +74,7 @@
       <w:r>
         <w:t xml:space="preserve"> </w:t>
       </w:r>
-      <w:hyperlink r:id="rId22">
+      <w:hyperlink r:id="rId23">
         <w:r>
           <w:rPr>
             <w:rStyle w:val="Hyperlink"/>
@@ -74,13 +82,18 @@
           <w:t xml:space="preserve">https://github.com/merriman-xyz</w:t>
         </w:r>
       </w:hyperlink>
-    </w:p>
-    <w:bookmarkEnd w:id="23"/>
-    <w:bookmarkStart w:id="24" w:name="professional-summary"/>
+      <w:r>
+        <w:t xml:space="preserve"> </w:t>
+      </w:r>
+      <w:r>
+        <w:t xml:space="preserve">| US and Irish dual citizen</w:t>
+      </w:r>
+    </w:p>
+    <w:bookmarkEnd w:id="24"/>
+    <w:bookmarkStart w:id="25" w:name="professional-summary"/>
     <w:p>
       <w:pPr>
         <w:pStyle w:val="Heading2"/>
-        <w:jc w:val="left"/>
       </w:pPr>
       <w:r>
         <w:t xml:space="preserve">Professional Summary</w:t>
@@ -89,18 +102,16 @@
     <w:p>
       <w:pPr>
         <w:pStyle w:val="FirstParagraph"/>
-        <w:jc w:val="left"/>
-      </w:pPr>
-      <w:r>
-        <w:t xml:space="preserve">Senior frontend engineer building JavaScript applications for complex data and operational workflows. Primary frontend engineer during the first year of a JPMorgan Chase analytics workspace for large data sets; promoted to Lead Software Engineer (Vice President) after two years. Now building local-first software. Available now for full-time frontend roles in NYC, on-site, hybrid, or remote.</w:t>
-      </w:r>
-    </w:p>
-    <w:bookmarkEnd w:id="24"/>
-    <w:bookmarkStart w:id="25" w:name="skills"/>
+      </w:pPr>
+      <w:r>
+        <w:t xml:space="preserve">Senior frontend engineer building JavaScript applications for complex data and operational workflows. Primary frontend engineer during the first year of a JPMorgan Chase analytics workspace for large data sets; promoted to Lead Software Engineer (Vice President) after two years. Now building local-first software. Available now for full-time frontend roles in the US or Europe, on-site, hybrid, or remote.</w:t>
+      </w:r>
+    </w:p>
+    <w:bookmarkEnd w:id="25"/>
+    <w:bookmarkStart w:id="26" w:name="skills"/>
     <w:p>
       <w:pPr>
         <w:pStyle w:val="Heading2"/>
-        <w:jc w:val="left"/>
       </w:pPr>
       <w:r>
         <w:t xml:space="preserve">Skills</w:t>
@@ -109,7 +120,6 @@
     <w:p>
       <w:pPr>
         <w:pStyle w:val="FirstParagraph"/>
-        <w:jc w:val="left"/>
       </w:pPr>
       <w:r>
         <w:rPr>
@@ -128,7 +138,6 @@
     <w:p>
       <w:pPr>
         <w:pStyle w:val="BodyText"/>
-        <w:jc w:val="left"/>
       </w:pPr>
       <w:r>
         <w:rPr>
@@ -147,7 +156,6 @@
     <w:p>
       <w:pPr>
         <w:pStyle w:val="BodyText"/>
-        <w:jc w:val="left"/>
       </w:pPr>
       <w:r>
         <w:rPr>
@@ -166,7 +174,6 @@
     <w:p>
       <w:pPr>
         <w:pStyle w:val="BodyText"/>
-        <w:jc w:val="left"/>
       </w:pPr>
       <w:r>
         <w:rPr>
@@ -182,22 +189,20 @@
         <w:t xml:space="preserve">Git, deployment</w:t>
       </w:r>
     </w:p>
-    <w:bookmarkEnd w:id="25"/>
-    <w:bookmarkStart w:id="30" w:name="work-experience"/>
+    <w:bookmarkEnd w:id="26"/>
+    <w:bookmarkStart w:id="31" w:name="work-experience"/>
     <w:p>
       <w:pPr>
         <w:pStyle w:val="Heading2"/>
-        <w:jc w:val="left"/>
       </w:pPr>
       <w:r>
         <w:t xml:space="preserve">Work Experience</w:t>
       </w:r>
     </w:p>
-    <w:bookmarkStart w:id="26" w:name="X2220ecd9cea25e04e7e56107b0122d06d6fa078"/>
+    <w:bookmarkStart w:id="27" w:name="X2220ecd9cea25e04e7e56107b0122d06d6fa078"/>
     <w:p>
       <w:pPr>
         <w:pStyle w:val="Heading3"/>
-        <w:jc w:val="left"/>
       </w:pPr>
       <w:r>
         <w:t xml:space="preserve">JPMorgan Chase | Lead Software Engineer (Vice President)</w:t>
@@ -206,7 +211,6 @@
     <w:p>
       <w:pPr>
         <w:pStyle w:val="FirstParagraph"/>
-        <w:jc w:val="left"/>
       </w:pPr>
       <w:r>
         <w:t xml:space="preserve">New York, NY | February 2025 - May 2026</w:t>
@@ -219,7 +223,6 @@
           <w:ilvl w:val="0"/>
           <w:numId w:val="1001"/>
         </w:numPr>
-        <w:jc w:val="left"/>
       </w:pPr>
       <w:r>
         <w:t xml:space="preserve">Promoted from Software Engineer III (Associate) to Lead Software Engineer (Vice President) in two years.</w:t>
@@ -232,18 +235,16 @@
           <w:ilvl w:val="0"/>
           <w:numId w:val="1001"/>
         </w:numPr>
-        <w:jc w:val="left"/>
       </w:pPr>
       <w:r>
         <w:t xml:space="preserve">Evaluated large language model (LLM) workflows for legacy application modernization and created reusable project guidance and user interface (UI) component constraints for AI-generated code.</w:t>
       </w:r>
     </w:p>
-    <w:bookmarkEnd w:id="26"/>
-    <w:bookmarkStart w:id="27" w:name="Xde20d3585f1f10816529bdac6e9e1d979ebe69c"/>
+    <w:bookmarkEnd w:id="27"/>
+    <w:bookmarkStart w:id="28" w:name="Xde20d3585f1f10816529bdac6e9e1d979ebe69c"/>
     <w:p>
       <w:pPr>
         <w:pStyle w:val="Heading3"/>
-        <w:jc w:val="left"/>
       </w:pPr>
       <w:r>
         <w:t xml:space="preserve">JPMorgan Chase | Software Engineer III (Associate)</w:t>
@@ -252,7 +253,6 @@
     <w:p>
       <w:pPr>
         <w:pStyle w:val="FirstParagraph"/>
-        <w:jc w:val="left"/>
       </w:pPr>
       <w:r>
         <w:t xml:space="preserve">New York, NY | January 2023 - January 2025</w:t>
@@ -265,7 +265,6 @@
           <w:ilvl w:val="0"/>
           <w:numId w:val="1002"/>
         </w:numPr>
-        <w:jc w:val="left"/>
       </w:pPr>
       <w:r>
         <w:t xml:space="preserve">Served as primary frontend engineer during the product’s first year, building a high-performance multi-grid analytics workspace on a small, fast-moving team.</w:t>
@@ -278,7 +277,6 @@
           <w:ilvl w:val="0"/>
           <w:numId w:val="1002"/>
         </w:numPr>
-        <w:jc w:val="left"/>
       </w:pPr>
       <w:r>
         <w:t xml:space="preserve">Enabled users to explore, join, pivot, and retrieve large server-held data sets.</w:t>
@@ -291,18 +289,16 @@
           <w:ilvl w:val="0"/>
           <w:numId w:val="1002"/>
         </w:numPr>
-        <w:jc w:val="left"/>
       </w:pPr>
       <w:r>
         <w:t xml:space="preserve">Implemented virtualized rendering, visible-window data fetching over WebSockets, client-side caching, and state management to keep every grid responsive.</w:t>
       </w:r>
     </w:p>
-    <w:bookmarkEnd w:id="27"/>
-    <w:bookmarkStart w:id="28" w:name="okg-tech-software-engineer"/>
+    <w:bookmarkEnd w:id="28"/>
+    <w:bookmarkStart w:id="29" w:name="okg-tech-software-engineer"/>
     <w:p>
       <w:pPr>
         <w:pStyle w:val="Heading3"/>
-        <w:jc w:val="left"/>
       </w:pPr>
       <w:r>
         <w:t xml:space="preserve">OKG Tech | Software Engineer</w:t>
@@ -311,7 +307,6 @@
     <w:p>
       <w:pPr>
         <w:pStyle w:val="FirstParagraph"/>
-        <w:jc w:val="left"/>
       </w:pPr>
       <w:r>
         <w:t xml:space="preserve">New York, NY | March 2022 - December 2022</w:t>
@@ -324,10 +319,9 @@
           <w:ilvl w:val="0"/>
           <w:numId w:val="1003"/>
         </w:numPr>
-        <w:jc w:val="left"/>
-      </w:pPr>
-      <w:r>
-        <w:t>Primary implementation engineer on a four-person team, developing an updated bus-ticketing system in React and Node.js.</w:t>
+      </w:pPr>
+      <w:r>
+        <w:t xml:space="preserve">Primary implementation engineer on a four-person team, developing an updated bus-ticketing system in React and Node.js.</w:t>
       </w:r>
     </w:p>
     <w:p>
@@ -337,18 +331,16 @@
           <w:ilvl w:val="0"/>
           <w:numId w:val="1003"/>
         </w:numPr>
-        <w:jc w:val="left"/>
-      </w:pPr>
-      <w:r>
-        <w:t>Developed scheduling, vaccination, appointment-reminder, and clinical-workflow features against eClinicalWorks and existing operational systems.</w:t>
-      </w:r>
-    </w:p>
-    <w:bookmarkEnd w:id="28"/>
-    <w:bookmarkStart w:id="29" w:name="yunshang-tea-co-founder"/>
+      </w:pPr>
+      <w:r>
+        <w:t xml:space="preserve">Developed scheduling, vaccination, appointment-reminder, and clinical-workflow features against eClinicalWorks and existing operational systems.</w:t>
+      </w:r>
+    </w:p>
+    <w:bookmarkEnd w:id="29"/>
+    <w:bookmarkStart w:id="30" w:name="yunshang-tea-co-founder"/>
     <w:p>
       <w:pPr>
         <w:pStyle w:val="Heading3"/>
-        <w:jc w:val="left"/>
       </w:pPr>
       <w:r>
         <w:t xml:space="preserve">Yunshang Tea | Co-Founder</w:t>
@@ -357,7 +349,6 @@
     <w:p>
       <w:pPr>
         <w:pStyle w:val="FirstParagraph"/>
-        <w:jc w:val="left"/>
       </w:pPr>
       <w:r>
         <w:t xml:space="preserve">Zhejiang, China | September 2015 - November 2021</w:t>
@@ -370,7 +361,6 @@
           <w:ilvl w:val="0"/>
           <w:numId w:val="1004"/>
         </w:numPr>
-        <w:jc w:val="left"/>
       </w:pPr>
       <w:r>
         <w:t xml:space="preserve">Managed retail and wholesale operations for a specialty tea business.</w:t>
@@ -383,19 +373,17 @@
           <w:ilvl w:val="0"/>
           <w:numId w:val="1004"/>
         </w:numPr>
-        <w:jc w:val="left"/>
       </w:pPr>
       <w:r>
         <w:t xml:space="preserve">Built database workflows for inventory, sales, and business operations.</w:t>
       </w:r>
     </w:p>
-    <w:bookmarkEnd w:id="29"/>
     <w:bookmarkEnd w:id="30"/>
-    <w:bookmarkStart w:id="33" w:name="selected-projects"/>
+    <w:bookmarkEnd w:id="31"/>
+    <w:bookmarkStart w:id="34" w:name="selected-projects"/>
     <w:p>
       <w:pPr>
         <w:pStyle w:val="Heading2"/>
-        <w:jc w:val="left"/>
       </w:pPr>
       <w:r>
         <w:t xml:space="preserve">Selected Projects</w:t>
@@ -408,9 +396,8 @@
           <w:ilvl w:val="0"/>
           <w:numId w:val="1005"/>
         </w:numPr>
-        <w:jc w:val="left"/>
-      </w:pPr>
-      <w:hyperlink r:id="rId31">
+      </w:pPr>
+      <w:hyperlink r:id="rId32">
         <w:r>
           <w:rPr>
             <w:rStyle w:val="Hyperlink"/>
@@ -448,9 +435,8 @@
           <w:ilvl w:val="0"/>
           <w:numId w:val="1005"/>
         </w:numPr>
-        <w:jc w:val="left"/>
-      </w:pPr>
-      <w:hyperlink r:id="rId32">
+      </w:pPr>
+      <w:hyperlink r:id="rId33">
         <w:r>
           <w:rPr>
             <w:rStyle w:val="Hyperlink"/>
@@ -481,22 +467,20 @@
         <w:t xml:space="preserve">Built an automated nightly Major League Baseball (MLB) ratings publication using Elo to rate hitters and pitchers from plate appearances.</w:t>
       </w:r>
     </w:p>
-    <w:bookmarkEnd w:id="33"/>
-    <w:bookmarkStart w:id="35" w:name="education"/>
+    <w:bookmarkEnd w:id="34"/>
+    <w:bookmarkStart w:id="36" w:name="education"/>
     <w:p>
       <w:pPr>
         <w:pStyle w:val="Heading2"/>
-        <w:jc w:val="left"/>
       </w:pPr>
       <w:r>
         <w:t xml:space="preserve">Education</w:t>
       </w:r>
     </w:p>
-    <w:bookmarkStart w:id="34" w:name="X23564dd18a40b47afa7f776ab361b72f1359cd3"/>
+    <w:bookmarkStart w:id="35" w:name="X23564dd18a40b47afa7f776ab361b72f1359cd3"/>
     <w:p>
       <w:pPr>
         <w:pStyle w:val="Heading3"/>
-        <w:jc w:val="left"/>
       </w:pPr>
       <w:r>
         <w:t xml:space="preserve">Manhattan College | Bachelor of Arts (BA) in Computer Science</w:t>
@@ -505,14 +489,13 @@
     <w:p>
       <w:pPr>
         <w:pStyle w:val="FirstParagraph"/>
-        <w:jc w:val="left"/>
       </w:pPr>
       <w:r>
         <w:t xml:space="preserve">Bronx, NY | Magna cum laude | Phi Beta Kappa</w:t>
       </w:r>
     </w:p>
-    <w:bookmarkEnd w:id="34"/>
     <w:bookmarkEnd w:id="35"/>
+    <w:bookmarkEnd w:id="36"/>
     <w:sectPr>
       <w:footnotePr>
         <w:numRestart w:val="eachSect"/>
@@ -557,7 +540,7 @@
       <w:lvlText w:val=" "/>
       <w:lvlJc w:val="left"/>
       <w:pPr>
-        <w:ind w:left="220" w:hanging="180"/>
+        <w:ind w:left="720" w:hanging="360"/>
       </w:pPr>
     </w:lvl>
     <w:lvl w:ilvl="1">
@@ -565,7 +548,7 @@
       <w:lvlText w:val=" "/>
       <w:lvlJc w:val="left"/>
       <w:pPr>
-        <w:ind w:left="220" w:hanging="180"/>
+        <w:ind w:left="1440" w:hanging="360"/>
       </w:pPr>
     </w:lvl>
     <w:lvl w:ilvl="2">
@@ -573,7 +556,7 @@
       <w:lvlText w:val=" "/>
       <w:lvlJc w:val="left"/>
       <w:pPr>
-        <w:ind w:left="220" w:hanging="180"/>
+        <w:ind w:left="2160" w:hanging="360"/>
       </w:pPr>
     </w:lvl>
     <w:lvl w:ilvl="3">
@@ -581,7 +564,7 @@
       <w:lvlText w:val=" "/>
       <w:lvlJc w:val="left"/>
       <w:pPr>
-        <w:ind w:left="220" w:hanging="180"/>
+        <w:ind w:left="2880" w:hanging="360"/>
       </w:pPr>
     </w:lvl>
     <w:lvl w:ilvl="4">
@@ -589,7 +572,7 @@
       <w:lvlText w:val=" "/>
       <w:lvlJc w:val="left"/>
       <w:pPr>
-        <w:ind w:left="220" w:hanging="180"/>
+        <w:ind w:left="3600" w:hanging="360"/>
       </w:pPr>
     </w:lvl>
     <w:lvl w:ilvl="5">
@@ -597,7 +580,7 @@
       <w:lvlText w:val=" "/>
       <w:lvlJc w:val="left"/>
       <w:pPr>
-        <w:ind w:left="220" w:hanging="180"/>
+        <w:ind w:left="4320" w:hanging="360"/>
       </w:pPr>
     </w:lvl>
     <w:lvl w:ilvl="6">
@@ -605,7 +588,7 @@
       <w:lvlText w:val=" "/>
       <w:lvlJc w:val="left"/>
       <w:pPr>
-        <w:ind w:left="220" w:hanging="180"/>
+        <w:ind w:left="5040" w:hanging="360"/>
       </w:pPr>
     </w:lvl>
     <w:lvl w:ilvl="7">
@@ -613,7 +596,7 @@
       <w:lvlText w:val=" "/>
       <w:lvlJc w:val="left"/>
       <w:pPr>
-        <w:ind w:left="220" w:hanging="180"/>
+        <w:ind w:left="5760" w:hanging="360"/>
       </w:pPr>
     </w:lvl>
     <w:lvl w:ilvl="8">
@@ -621,7 +604,7 @@
       <w:lvlText w:val=" "/>
       <w:lvlJc w:val="left"/>
       <w:pPr>
-        <w:ind w:left="220" w:hanging="180"/>
+        <w:ind w:left="6480" w:hanging="360"/>
       </w:pPr>
     </w:lvl>
   </w:abstractNum>
@@ -633,7 +616,7 @@
       <w:lvlText w:val=""/>
       <w:lvlJc w:val="left"/>
       <w:pPr>
-        <w:ind w:left="220" w:hanging="180"/>
+        <w:ind w:left="720" w:hanging="360"/>
       </w:pPr>
       <w:rPr>
         <w:rFonts w:ascii="Symbol" w:hAnsi="Symbol" w:cs="Symbol" w:hint="default"/>
@@ -644,7 +627,7 @@
       <w:lvlText w:val="o"/>
       <w:lvlJc w:val="left"/>
       <w:pPr>
-        <w:ind w:left="220" w:hanging="180"/>
+        <w:ind w:left="1440" w:hanging="360"/>
       </w:pPr>
       <w:rPr>
         <w:rFonts w:ascii="Courier New" w:hAnsi="Courier New" w:cs="Courier New" w:hint="default"/>
@@ -655,7 +638,7 @@
       <w:lvlText w:val=""/>
       <w:lvlJc w:val="left"/>
       <w:pPr>
-        <w:ind w:left="220" w:hanging="180"/>
+        <w:ind w:left="2160" w:hanging="360"/>
       </w:pPr>
       <w:rPr>
         <w:rFonts w:ascii="Wingdings" w:hAnsi="Wingdings" w:cs="Wingdings" w:hint="default"/>
@@ -666,7 +649,7 @@
       <w:lvlText w:val=""/>
       <w:lvlJc w:val="left"/>
       <w:pPr>
-        <w:ind w:left="220" w:hanging="180"/>
+        <w:ind w:left="2880" w:hanging="360"/>
       </w:pPr>
       <w:rPr>
         <w:rFonts w:ascii="Symbol" w:hAnsi="Symbol" w:cs="Symbol" w:hint="default"/>
@@ -677,7 +660,7 @@
       <w:lvlText w:val="o"/>
       <w:lvlJc w:val="left"/>
       <w:pPr>
-        <w:ind w:left="220" w:hanging="180"/>
+        <w:ind w:left="3600" w:hanging="360"/>
       </w:pPr>
       <w:rPr>
         <w:rFonts w:ascii="Courier New" w:hAnsi="Courier New" w:cs="Courier New" w:hint="default"/>
@@ -688,7 +671,7 @@
       <w:lvlText w:val=""/>
       <w:lvlJc w:val="left"/>
       <w:pPr>
-        <w:ind w:left="220" w:hanging="180"/>
+        <w:ind w:left="4320" w:hanging="360"/>
       </w:pPr>
       <w:rPr>
         <w:rFonts w:ascii="Wingdings" w:hAnsi="Wingdings" w:cs="Wingdings" w:hint="default"/>
@@ -699,7 +682,7 @@
       <w:lvlText w:val=""/>
       <w:lvlJc w:val="left"/>
       <w:pPr>
-        <w:ind w:left="220" w:hanging="180"/>
+        <w:ind w:left="5040" w:hanging="360"/>
       </w:pPr>
       <w:rPr>
         <w:rFonts w:ascii="Symbol" w:hAnsi="Symbol" w:cs="Symbol" w:hint="default"/>
@@ -710,7 +693,7 @@
       <w:lvlText w:val="o"/>
       <w:lvlJc w:val="left"/>
       <w:pPr>
-        <w:ind w:left="220" w:hanging="180"/>
+        <w:ind w:left="5760" w:hanging="360"/>
       </w:pPr>
       <w:rPr>
         <w:rFonts w:ascii="Courier New" w:hAnsi="Courier New" w:cs="Courier New" w:hint="default"/>
@@ -721,7 +704,7 @@
       <w:lvlText w:val=""/>
       <w:lvlJc w:val="left"/>
       <w:pPr>
-        <w:ind w:left="220" w:hanging="180"/>
+        <w:ind w:left="6480" w:hanging="360"/>
       </w:pPr>
       <w:rPr>
         <w:rFonts w:ascii="Wingdings" w:hAnsi="Wingdings" w:cs="Wingdings" w:hint="default"/>

</xml_diff>

<commit_message>
Simplify public resume location and omit citizenship
</commit_message>
<xml_diff>
--- a/resume.docx
+++ b/resume.docx
@@ -24,7 +24,7 @@
         <w:pStyle w:val="BodyText"/>
       </w:pPr>
       <w:r>
-        <w:t xml:space="preserve">White Plains, NY (NYC via Metro-North) |</w:t>
+        <w:t xml:space="preserve">NYC area |</w:t>
       </w:r>
       <w:r>
         <w:t xml:space="preserve"> </w:t>
@@ -82,12 +82,6 @@
           <w:t xml:space="preserve">https://github.com/merriman-xyz</w:t>
         </w:r>
       </w:hyperlink>
-      <w:r>
-        <w:t xml:space="preserve"> </w:t>
-      </w:r>
-      <w:r>
-        <w:t xml:space="preserve">| US and Irish dual citizen</w:t>
-      </w:r>
     </w:p>
     <w:bookmarkEnd w:id="24"/>
     <w:bookmarkStart w:id="25" w:name="professional-summary"/>

</xml_diff>

<commit_message>
Publish reconciled résumé: Monsey OKG, plain wording, grouped JPMorgan roles
Homepage, résumé page, PDF and DOCX now carry the same text.

Co-Authored-By: Claude Opus 5.5 <noreply@anthropic.com>
</commit_message>
<xml_diff>
--- a/resume.docx
+++ b/resume.docx
@@ -2,10 +2,11 @@
 <file path=word/document.xml><?xml version="1.0" encoding="utf-8"?>
 <w:document xmlns:w="http://schemas.openxmlformats.org/wordprocessingml/2006/main" xmlns:m="http://schemas.openxmlformats.org/officeDocument/2006/math" xmlns:r="http://schemas.openxmlformats.org/officeDocument/2006/relationships" xmlns:o="urn:schemas-microsoft-com:office:office" xmlns:v="urn:schemas-microsoft-com:vml" xmlns:w10="urn:schemas-microsoft-com:office:word" xmlns:a="http://schemas.openxmlformats.org/drawingml/2006/main" xmlns:pic="http://schemas.openxmlformats.org/drawingml/2006/picture" xmlns:wp="http://schemas.openxmlformats.org/drawingml/2006/wordprocessingDrawing">
   <w:body>
-    <w:bookmarkStart w:id="24" w:name="brian-merriman"/>
+    <w:bookmarkStart w:id="23" w:name="brian-merriman"/>
     <w:p>
       <w:pPr>
         <w:pStyle w:val="Title"/>
+        <w:jc w:val="left"/>
       </w:pPr>
       <w:r>
         <w:t xml:space="preserve">Brian Merriman</w:t>
@@ -16,7 +17,7 @@
         <w:pStyle w:val="FirstParagraph"/>
       </w:pPr>
       <w:r>
-        <w:t xml:space="preserve">Senior Frontend Engineer | Frontend Software Engineer | Complex Data Applications</w:t>
+        <w:t xml:space="preserve">Senior Frontend Engineer | Complex Data Applications</w:t>
       </w:r>
     </w:p>
     <w:p>
@@ -57,112 +58,138 @@
       <w:r>
         <w:br/>
       </w:r>
+      <w:r>
+        <w:t xml:space="preserve">Website: </w:t>
+      </w:r>
       <w:hyperlink r:id="rId22">
         <w:r>
           <w:rPr>
             <w:rStyle w:val="Hyperlink"/>
           </w:rPr>
-          <w:t xml:space="preserve">https://merriman.xyz</w:t>
+          <w:t xml:space="preserve">merriman.xyz</w:t>
         </w:r>
       </w:hyperlink>
-      <w:r>
-        <w:t xml:space="preserve"> </w:t>
-      </w:r>
-      <w:r>
-        <w:t xml:space="preserve">|</w:t>
-      </w:r>
-      <w:r>
-        <w:t xml:space="preserve"> </w:t>
-      </w:r>
-      <w:hyperlink r:id="rId23">
-        <w:r>
-          <w:rPr>
-            <w:rStyle w:val="Hyperlink"/>
-          </w:rPr>
-          <w:t xml:space="preserve">https://github.com/merriman-xyz</w:t>
-        </w:r>
-      </w:hyperlink>
+    </w:p>
+    <w:bookmarkEnd w:id="23"/>
+    <w:bookmarkStart w:id="24" w:name="professional-summary"/>
+    <w:p>
+      <w:pPr>
+        <w:pStyle w:val="Heading2"/>
+      </w:pPr>
+      <w:r>
+        <w:t xml:space="preserve">Professional Summary</w:t>
+      </w:r>
+    </w:p>
+    <w:p>
+      <w:pPr>
+        <w:pStyle w:val="FirstParagraph"/>
+      </w:pPr>
+      <w:r>
+        <w:t xml:space="preserve">Senior frontend engineer building JavaScript applications for data analysis and business operations. Former Lead Software Engineer (Vice President) at JPMorgan Chase. Now building local-first software. Available now for full-time frontend roles in the US or Europe, on-site, hybrid, or remote.</w:t>
+      </w:r>
     </w:p>
     <w:bookmarkEnd w:id="24"/>
-    <w:bookmarkStart w:id="25" w:name="professional-summary"/>
+    <w:bookmarkStart w:id="25" w:name="skills"/>
     <w:p>
       <w:pPr>
         <w:pStyle w:val="Heading2"/>
       </w:pPr>
       <w:r>
-        <w:t xml:space="preserve">Professional Summary</w:t>
-      </w:r>
-    </w:p>
-    <w:p>
-      <w:pPr>
-        <w:pStyle w:val="FirstParagraph"/>
-      </w:pPr>
-      <w:r>
-        <w:t xml:space="preserve">Senior frontend engineer building JavaScript applications for complex data and operational workflows. Primary frontend engineer during the first year of a JPMorgan Chase analytics workspace for large data sets; promoted to Lead Software Engineer (Vice President) after two years. Now building local-first software. Available now for full-time frontend roles in the US or Europe, on-site, hybrid, or remote.</w:t>
-      </w:r>
-    </w:p>
-    <w:bookmarkEnd w:id="25"/>
-    <w:bookmarkStart w:id="26" w:name="skills"/>
-    <w:p>
-      <w:pPr>
-        <w:pStyle w:val="Heading2"/>
-      </w:pPr>
-      <w:r>
         <w:t xml:space="preserve">Skills</w:t>
       </w:r>
     </w:p>
     <w:p>
       <w:pPr>
-        <w:pStyle w:val="FirstParagraph"/>
+        <w:pStyle w:val="BodyText"/>
+        <w:tabs>
+          <w:tab w:pos="1760" w:val="left"/>
+        </w:tabs>
+        <w:spacing w:before="0" w:after="20"/>
+        <w:ind w:left="1760" w:hanging="1760"/>
       </w:pPr>
       <w:r>
         <w:rPr>
           <w:b/>
-          <w:bCs/>
         </w:rPr>
-        <w:t xml:space="preserve">Programming:</w:t>
-      </w:r>
-      <w:r>
-        <w:t xml:space="preserve"> </w:t>
-      </w:r>
-      <w:r>
-        <w:t xml:space="preserve">JavaScript (ES6+), SQL, HTML5, CSS3</w:t>
+        <w:t>Frontend:</w:t>
+      </w:r>
+      <w:r>
+        <w:tab/>
+        <w:t>JavaScript (ES6+), React, HTML, CSS, data visualization, virtualized rendering</w:t>
       </w:r>
     </w:p>
     <w:p>
       <w:pPr>
         <w:pStyle w:val="BodyText"/>
+        <w:tabs>
+          <w:tab w:pos="1760" w:val="left"/>
+        </w:tabs>
+        <w:spacing w:before="0" w:after="20"/>
+        <w:ind w:left="1760" w:hanging="1760"/>
       </w:pPr>
       <w:r>
         <w:rPr>
           <w:b/>
-          <w:bCs/>
         </w:rPr>
-        <w:t xml:space="preserve">Frontend:</w:t>
-      </w:r>
-      <w:r>
-        <w:t xml:space="preserve"> </w:t>
-      </w:r>
-      <w:r>
-        <w:t xml:space="preserve">React, vanilla JavaScript, data visualization, frontend architecture, virtualized rendering, web performance optimization, state management, client-side caching</w:t>
+        <w:t>Data &amp; Tools:</w:t>
+      </w:r>
+      <w:r>
+        <w:tab/>
+        <w:t>Node.js, SQL, SQLite, IndexedDB (Dexie), REST APIs, WebSockets, Git</w:t>
       </w:r>
     </w:p>
     <w:p>
       <w:pPr>
         <w:pStyle w:val="BodyText"/>
+        <w:tabs>
+          <w:tab w:pos="1760" w:val="left"/>
+        </w:tabs>
+        <w:spacing w:before="0" w:after="20"/>
+        <w:ind w:left="1760" w:hanging="1760"/>
       </w:pPr>
       <w:r>
         <w:rPr>
           <w:b/>
-          <w:bCs/>
         </w:rPr>
-        <w:t xml:space="preserve">Data and Backend:</w:t>
-      </w:r>
-      <w:r>
-        <w:t xml:space="preserve"> </w:t>
-      </w:r>
-      <w:r>
-        <w:t xml:space="preserve">Node.js, SQLite, IndexedDB, Dexie, REST API integration, WebSockets, local-first synchronization, data modeling</w:t>
+        <w:t>AI Development:</w:t>
+      </w:r>
+      <w:r>
+        <w:tab/>
+        <w:t>Agentic software development, reusable project instructions, independent review</w:t>
+      </w:r>
+    </w:p>
+    <w:bookmarkEnd w:id="25"/>
+    <w:bookmarkStart w:id="29" w:name="work-experience"/>
+    <w:p>
+      <w:pPr>
+        <w:pStyle w:val="Heading2"/>
+      </w:pPr>
+      <w:r>
+        <w:t xml:space="preserve">Work Experience</w:t>
+      </w:r>
+    </w:p>
+    <w:bookmarkStart w:id="26" w:name="Xf0c707431aa2d5714429c7db3203f1092ecc9ef"/>
+    <w:p>
+      <w:pPr>
+        <w:pStyle w:val="Heading3"/>
+      </w:pPr>
+      <w:r>
+        <w:t>JPMorgan Chase</w:t>
+      </w:r>
+      <w:r>
+        <w:rPr>
+          <w:b w:val="0"/>
+          <w:sz w:val="20"/>
+        </w:rPr>
+        <w:t xml:space="preserve"> | New York, NY | January 2023 - May 2026</w:t>
+      </w:r>
+    </w:p>
+    <w:p>
+      <w:pPr>
+        <w:pStyle w:val="FirstParagraph"/>
+      </w:pPr>
+      <w:r>
+        <w:t xml:space="preserve">Lead Software Engineer (Vice President) | February 2025 - May 2026</w:t>
       </w:r>
     </w:p>
     <w:p>
@@ -170,44 +197,7 @@
         <w:pStyle w:val="BodyText"/>
       </w:pPr>
       <w:r>
-        <w:rPr>
-          <w:b/>
-          <w:bCs/>
-        </w:rPr>
-        <w:t xml:space="preserve">Engineering:</w:t>
-      </w:r>
-      <w:r>
-        <w:t xml:space="preserve"> </w:t>
-      </w:r>
-      <w:r>
-        <w:t xml:space="preserve">Git, deployment</w:t>
-      </w:r>
-    </w:p>
-    <w:bookmarkEnd w:id="26"/>
-    <w:bookmarkStart w:id="31" w:name="work-experience"/>
-    <w:p>
-      <w:pPr>
-        <w:pStyle w:val="Heading2"/>
-      </w:pPr>
-      <w:r>
-        <w:t xml:space="preserve">Work Experience</w:t>
-      </w:r>
-    </w:p>
-    <w:bookmarkStart w:id="27" w:name="X2220ecd9cea25e04e7e56107b0122d06d6fa078"/>
-    <w:p>
-      <w:pPr>
-        <w:pStyle w:val="Heading3"/>
-      </w:pPr>
-      <w:r>
-        <w:t xml:space="preserve">JPMorgan Chase | Lead Software Engineer (Vice President)</w:t>
-      </w:r>
-    </w:p>
-    <w:p>
-      <w:pPr>
-        <w:pStyle w:val="FirstParagraph"/>
-      </w:pPr>
-      <w:r>
-        <w:t xml:space="preserve">New York, NY | February 2025 - May 2026</w:t>
+        <w:t xml:space="preserve">Software Engineer III (Associate) | January 2023 - January 2025</w:t>
       </w:r>
     </w:p>
     <w:p>
@@ -219,7 +209,7 @@
         </w:numPr>
       </w:pPr>
       <w:r>
-        <w:t xml:space="preserve">Promoted from Software Engineer III (Associate) to Lead Software Engineer (Vice President) in two years.</w:t>
+        <w:t xml:space="preserve">Built a multi-grid analytics workspace for large data sets. Served as its primary frontend engineer in the first year and continued to improve it.</w:t>
       </w:r>
     </w:p>
     <w:p>
@@ -231,17 +221,49 @@
         </w:numPr>
       </w:pPr>
       <w:r>
-        <w:t xml:space="preserve">Evaluated large language model (LLM) workflows for legacy application modernization and created reusable project guidance and user interface (UI) component constraints for AI-generated code.</w:t>
-      </w:r>
-    </w:p>
-    <w:bookmarkEnd w:id="27"/>
-    <w:bookmarkStart w:id="28" w:name="Xde20d3585f1f10816529bdac6e9e1d979ebe69c"/>
+        <w:t xml:space="preserve">Built a React shell around a vanilla JavaScript grid core with virtualized rendering. Added tools to visualize, explore, join, and pivot data.</w:t>
+      </w:r>
+    </w:p>
+    <w:p>
+      <w:pPr>
+        <w:pStyle w:val="Compact"/>
+        <w:numPr>
+          <w:ilvl w:val="0"/>
+          <w:numId w:val="1001"/>
+        </w:numPr>
+      </w:pPr>
+      <w:r>
+        <w:t xml:space="preserve">Built on-demand data loading and client-side caching for large, server-backed grids.</w:t>
+      </w:r>
+    </w:p>
+    <w:p>
+      <w:pPr>
+        <w:pStyle w:val="Compact"/>
+        <w:numPr>
+          <w:ilvl w:val="0"/>
+          <w:numId w:val="1001"/>
+        </w:numPr>
+      </w:pPr>
+      <w:r>
+        <w:t xml:space="preserve">Helped introduce AI-assisted development for the analytics workspace. Guided coding agents with reusable project instructions and UI component standards.</w:t>
+      </w:r>
+    </w:p>
+    <w:bookmarkEnd w:id="26"/>
+    <w:bookmarkStart w:id="27" w:name="okg-tech-new-york-ny"/>
     <w:p>
       <w:pPr>
         <w:pStyle w:val="Heading3"/>
-      </w:pPr>
-      <w:r>
-        <w:t xml:space="preserve">JPMorgan Chase | Software Engineer III (Associate)</w:t>
+        <w:spacing w:before="140"/>
+      </w:pPr>
+      <w:r>
+        <w:t>OKG Tech</w:t>
+      </w:r>
+      <w:r>
+        <w:rPr>
+          <w:b w:val="0"/>
+          <w:sz w:val="20"/>
+        </w:rPr>
+        <w:t xml:space="preserve"> | Monsey, NY</w:t>
       </w:r>
     </w:p>
     <w:p>
@@ -249,7 +271,7 @@
         <w:pStyle w:val="FirstParagraph"/>
       </w:pPr>
       <w:r>
-        <w:t xml:space="preserve">New York, NY | January 2023 - January 2025</w:t>
+        <w:t xml:space="preserve">Software Engineer | March 2022 - December 2022</w:t>
       </w:r>
     </w:p>
     <w:p>
@@ -261,7 +283,7 @@
         </w:numPr>
       </w:pPr>
       <w:r>
-        <w:t xml:space="preserve">Served as primary frontend engineer during the product’s first year, building a high-performance multi-grid analytics workspace on a small, fast-moving team.</w:t>
+        <w:t xml:space="preserve">Updated a bus-ticketing system for a health center.</w:t>
       </w:r>
     </w:p>
     <w:p>
@@ -273,7 +295,7 @@
         </w:numPr>
       </w:pPr>
       <w:r>
-        <w:t xml:space="preserve">Enabled users to explore, join, pivot, and retrieve large server-held data sets.</w:t>
+        <w:t xml:space="preserve">Built a scheduling system for the same health center, with a React frontend and Node.js backend.</w:t>
       </w:r>
     </w:p>
     <w:p>
@@ -285,17 +307,25 @@
         </w:numPr>
       </w:pPr>
       <w:r>
-        <w:t xml:space="preserve">Implemented virtualized rendering, visible-window data fetching over WebSockets, client-side caching, and state management to keep every grid responsive.</w:t>
-      </w:r>
-    </w:p>
-    <w:bookmarkEnd w:id="28"/>
-    <w:bookmarkStart w:id="29" w:name="okg-tech-software-engineer"/>
+        <w:t xml:space="preserve">Contributed improvements across several other projects.</w:t>
+      </w:r>
+    </w:p>
+    <w:bookmarkEnd w:id="27"/>
+    <w:bookmarkStart w:id="28" w:name="yunshang-tea-zhejiang-china"/>
     <w:p>
       <w:pPr>
         <w:pStyle w:val="Heading3"/>
-      </w:pPr>
-      <w:r>
-        <w:t xml:space="preserve">OKG Tech | Software Engineer</w:t>
+        <w:spacing w:before="140"/>
+      </w:pPr>
+      <w:r>
+        <w:t>Yunshang Tea</w:t>
+      </w:r>
+      <w:r>
+        <w:rPr>
+          <w:b w:val="0"/>
+          <w:sz w:val="20"/>
+        </w:rPr>
+        <w:t xml:space="preserve"> | Zhejiang, China</w:t>
       </w:r>
     </w:p>
     <w:p>
@@ -303,7 +333,7 @@
         <w:pStyle w:val="FirstParagraph"/>
       </w:pPr>
       <w:r>
-        <w:t xml:space="preserve">New York, NY | March 2022 - December 2022</w:t>
+        <w:t xml:space="preserve">Co-Founder | September 2015 - November 2021</w:t>
       </w:r>
     </w:p>
     <w:p>
@@ -315,7 +345,7 @@
         </w:numPr>
       </w:pPr>
       <w:r>
-        <w:t xml:space="preserve">Primary implementation engineer on a four-person team, developing an updated bus-ticketing system in React and Node.js.</w:t>
+        <w:t xml:space="preserve">Managed retail and wholesale operations for a specialty tea business.</w:t>
       </w:r>
     </w:p>
     <w:p>
@@ -327,25 +357,38 @@
         </w:numPr>
       </w:pPr>
       <w:r>
-        <w:t xml:space="preserve">Developed scheduling, vaccination, appointment-reminder, and clinical-workflow features against eClinicalWorks and existing operational systems.</w:t>
-      </w:r>
-    </w:p>
+        <w:t xml:space="preserve">Built database workflows for inventory, sales, and business operations.</w:t>
+      </w:r>
+    </w:p>
+    <w:bookmarkEnd w:id="28"/>
     <w:bookmarkEnd w:id="29"/>
-    <w:bookmarkStart w:id="30" w:name="yunshang-tea-co-founder"/>
+    <w:bookmarkStart w:id="34" w:name="selected-projects"/>
+    <w:p>
+      <w:pPr>
+        <w:pStyle w:val="Heading2"/>
+      </w:pPr>
+      <w:r>
+        <w:t xml:space="preserve">Selected Projects</w:t>
+      </w:r>
+    </w:p>
+    <w:bookmarkStart w:id="31" w:name="ingrid-2026"/>
     <w:p>
       <w:pPr>
         <w:pStyle w:val="Heading3"/>
       </w:pPr>
-      <w:r>
-        <w:t xml:space="preserve">Yunshang Tea | Co-Founder</w:t>
-      </w:r>
-    </w:p>
-    <w:p>
-      <w:pPr>
-        <w:pStyle w:val="FirstParagraph"/>
-      </w:pPr>
-      <w:r>
-        <w:t xml:space="preserve">Zhejiang, China | September 2015 - November 2021</w:t>
+      <w:hyperlink r:id="rId30">
+        <w:r>
+          <w:rPr>
+            <w:rStyle w:val="Hyperlink"/>
+          </w:rPr>
+          <w:t xml:space="preserve">Ingrid</w:t>
+        </w:r>
+      </w:hyperlink>
+      <w:r>
+        <w:t xml:space="preserve"> </w:t>
+      </w:r>
+      <w:r>
+        <w:t xml:space="preserve">(2026)</w:t>
       </w:r>
     </w:p>
     <w:p>
@@ -357,7 +400,7 @@
         </w:numPr>
       </w:pPr>
       <w:r>
-        <w:t xml:space="preserve">Managed retail and wholesale operations for a specialty tea business.</w:t>
+        <w:t xml:space="preserve">Shipped a local-first grid app with a React shell and vanilla JavaScript editor core. Added virtualized rendering, multi-device sync, and subscription billing.</w:t>
       </w:r>
     </w:p>
     <w:p>
@@ -369,18 +412,29 @@
         </w:numPr>
       </w:pPr>
       <w:r>
-        <w:t xml:space="preserve">Built database workflows for inventory, sales, and business operations.</w:t>
-      </w:r>
-    </w:p>
-    <w:bookmarkEnd w:id="30"/>
+        <w:t xml:space="preserve">Directed development of an AI editing prototype within Ingrid. It previews changes to selected content before applying them and supports undo and redo.</w:t>
+      </w:r>
+    </w:p>
     <w:bookmarkEnd w:id="31"/>
-    <w:bookmarkStart w:id="34" w:name="selected-projects"/>
-    <w:p>
-      <w:pPr>
-        <w:pStyle w:val="Heading2"/>
-      </w:pPr>
-      <w:r>
-        <w:t xml:space="preserve">Selected Projects</w:t>
+    <w:bookmarkStart w:id="33" w:name="showdown-elo-2026"/>
+    <w:p>
+      <w:pPr>
+        <w:pStyle w:val="Heading3"/>
+        <w:spacing w:before="140"/>
+      </w:pPr>
+      <w:hyperlink r:id="rId32">
+        <w:r>
+          <w:rPr>
+            <w:rStyle w:val="Hyperlink"/>
+          </w:rPr>
+          <w:t xml:space="preserve">Showdown Elo</w:t>
+        </w:r>
+      </w:hyperlink>
+      <w:r>
+        <w:t xml:space="preserve"> </w:t>
+      </w:r>
+      <w:r>
+        <w:t xml:space="preserve">(2026)</w:t>
       </w:r>
     </w:p>
     <w:p>
@@ -391,76 +445,11 @@
           <w:numId w:val="1005"/>
         </w:numPr>
       </w:pPr>
-      <w:hyperlink r:id="rId32">
-        <w:r>
-          <w:rPr>
-            <w:rStyle w:val="Hyperlink"/>
-            <w:b/>
-            <w:bCs/>
-          </w:rPr>
-          <w:t xml:space="preserve">Ingrid</w:t>
-        </w:r>
-      </w:hyperlink>
-      <w:r>
-        <w:rPr>
-          <w:b/>
-          <w:bCs/>
-        </w:rPr>
-        <w:t xml:space="preserve"> </w:t>
-      </w:r>
-      <w:r>
-        <w:rPr>
-          <w:b/>
-          <w:bCs/>
-        </w:rPr>
-        <w:t xml:space="preserve">(2026):</w:t>
-      </w:r>
-      <w:r>
-        <w:t xml:space="preserve"> </w:t>
-      </w:r>
-      <w:r>
-        <w:t xml:space="preserve">Built a local-first hierarchical grid application using JavaScript, IndexedDB, and Dexie for client-side persistence, with production cloud synchronization and subscription billing.</w:t>
-      </w:r>
-    </w:p>
-    <w:p>
-      <w:pPr>
-        <w:pStyle w:val="Compact"/>
-        <w:numPr>
-          <w:ilvl w:val="0"/>
-          <w:numId w:val="1005"/>
-        </w:numPr>
-      </w:pPr>
-      <w:hyperlink r:id="rId33">
-        <w:r>
-          <w:rPr>
-            <w:rStyle w:val="Hyperlink"/>
-            <w:b/>
-            <w:bCs/>
-          </w:rPr>
-          <w:t xml:space="preserve">Showdown Elo</w:t>
-        </w:r>
-      </w:hyperlink>
-      <w:r>
-        <w:rPr>
-          <w:b/>
-          <w:bCs/>
-        </w:rPr>
-        <w:t xml:space="preserve"> </w:t>
-      </w:r>
-      <w:r>
-        <w:rPr>
-          <w:b/>
-          <w:bCs/>
-        </w:rPr>
-        <w:t xml:space="preserve">(2026):</w:t>
-      </w:r>
-      <w:r>
-        <w:t xml:space="preserve"> </w:t>
-      </w:r>
-      <w:r>
-        <w:t xml:space="preserve">Built an automated nightly Major League Baseball (MLB) ratings publication using Elo to rate hitters and pitchers from plate appearances.</w:t>
-      </w:r>
-    </w:p>
+      <w:r>
+        <w:t xml:space="preserve">Built an automated nightly Major League Baseball (MLB) ratings site. It rates hitters and pitchers from plate appearances using Elo.</w:t>
+      </w:r>
+    </w:p>
+    <w:bookmarkEnd w:id="33"/>
     <w:bookmarkEnd w:id="34"/>
     <w:bookmarkStart w:id="36" w:name="education"/>
     <w:p>
@@ -471,13 +460,13 @@
         <w:t xml:space="preserve">Education</w:t>
       </w:r>
     </w:p>
-    <w:bookmarkStart w:id="35" w:name="X23564dd18a40b47afa7f776ab361b72f1359cd3"/>
+    <w:bookmarkStart w:id="35" w:name="manhattan-college"/>
     <w:p>
       <w:pPr>
         <w:pStyle w:val="Heading3"/>
       </w:pPr>
       <w:r>
-        <w:t xml:space="preserve">Manhattan College | Bachelor of Arts (BA) in Computer Science</w:t>
+        <w:t xml:space="preserve">Manhattan College</w:t>
       </w:r>
     </w:p>
     <w:p>
@@ -485,7 +474,15 @@
         <w:pStyle w:val="FirstParagraph"/>
       </w:pPr>
       <w:r>
-        <w:t xml:space="preserve">Bronx, NY | Magna cum laude | Phi Beta Kappa</w:t>
+        <w:t xml:space="preserve">Bachelor of Arts (BA) in Computer Science</w:t>
+      </w:r>
+    </w:p>
+    <w:p>
+      <w:pPr>
+        <w:pStyle w:val="BodyText"/>
+      </w:pPr>
+      <w:r>
+        <w:t xml:space="preserve">Bronx, NY | magna cum laude | Phi Beta Kappa</w:t>
       </w:r>
     </w:p>
     <w:bookmarkEnd w:id="35"/>
@@ -610,7 +607,10 @@
       <w:lvlText w:val=""/>
       <w:lvlJc w:val="left"/>
       <w:pPr>
-        <w:ind w:left="720" w:hanging="360"/>
+        <w:tabs>
+          <w:tab w:val="num" w:pos="280"/>
+        </w:tabs>
+        <w:ind w:left="280" w:hanging="240"/>
       </w:pPr>
       <w:rPr>
         <w:rFonts w:ascii="Symbol" w:hAnsi="Symbol" w:cs="Symbol" w:hint="default"/>
@@ -748,7 +748,7 @@
     <w:name w:val="Normal"/>
     <w:qFormat/>
     <w:pPr>
-      <w:spacing w:after="40" w:before="0" w:line="252" w:lineRule="auto"/>
+      <w:spacing w:after="10" w:before="0" w:line="240" w:lineRule="auto"/>
     </w:pPr>
     <w:rPr>
       <w:rFonts w:ascii="Arial" w:hAnsi="Arial"/>
@@ -762,7 +762,7 @@
     <w:link w:val="BodyTextChar"/>
     <w:qFormat/>
     <w:pPr>
-      <w:spacing w:after="40" w:before="0" w:line="252" w:lineRule="auto"/>
+      <w:spacing w:after="10" w:before="0" w:line="240" w:lineRule="auto"/>
     </w:pPr>
     <w:rPr>
       <w:rFonts w:ascii="Arial" w:hAnsi="Arial"/>
@@ -776,7 +776,7 @@
     <w:next w:val="BodyText"/>
     <w:qFormat/>
     <w:pPr>
-      <w:spacing w:after="40" w:before="0" w:line="252" w:lineRule="auto"/>
+      <w:spacing w:after="10" w:before="0" w:line="240" w:lineRule="auto"/>
     </w:pPr>
     <w:rPr>
       <w:rFonts w:ascii="Arial" w:hAnsi="Arial"/>
@@ -789,7 +789,7 @@
     <w:basedOn w:val="BodyText"/>
     <w:qFormat/>
     <w:pPr>
-      <w:spacing w:after="40" w:before="0" w:line="252" w:lineRule="auto"/>
+      <w:spacing w:after="12" w:before="0" w:line="240" w:lineRule="auto"/>
     </w:pPr>
     <w:rPr>
       <w:rFonts w:ascii="Arial" w:hAnsi="Arial"/>
@@ -809,7 +809,7 @@
       <w:keepNext/>
       <w:spacing w:after="40" w:before="0" w:line="252" w:lineRule="auto"/>
       <w:contextualSpacing/>
-      <w:jc w:val="center"/>
+      <w:jc w:val="left"/>
     </w:pPr>
     <w:rPr>
       <w:rFonts w:ascii="Arial" w:hAnsi="Arial"/>
@@ -988,12 +988,13 @@
     <w:pPr>
       <w:keepNext/>
       <w:keepLines/>
-      <w:spacing w:after="40" w:before="120" w:line="252" w:lineRule="auto"/>
+      <w:spacing w:after="60" w:before="160" w:line="252" w:lineRule="auto"/>
       <w:outlineLvl w:val="1"/>
     </w:pPr>
     <w:rPr>
       <w:rFonts w:ascii="Arial" w:hAnsi="Arial"/>
       <w:b/>
+      <w:caps/>
       <w:color w:val="000000"/>
       <w:sz w:val="22"/>
       <w:szCs w:val="32"/>
@@ -1012,7 +1013,7 @@
     <w:pPr>
       <w:keepNext/>
       <w:keepLines/>
-      <w:spacing w:after="20" w:before="80" w:line="252" w:lineRule="auto"/>
+      <w:spacing w:after="10" w:before="60" w:line="252" w:lineRule="auto"/>
       <w:outlineLvl w:val="2"/>
     </w:pPr>
     <w:rPr>

</xml_diff>

<commit_message>
Say both OKG projects used React and Node.js
Co-Authored-By: Claude Opus 5.5 <noreply@anthropic.com>
</commit_message>
<xml_diff>
--- a/resume.docx
+++ b/resume.docx
@@ -283,7 +283,7 @@
         </w:numPr>
       </w:pPr>
       <w:r>
-        <w:t xml:space="preserve">Updated a bus-ticketing system for a health center.</w:t>
+        <w:t xml:space="preserve">Updated a bus-ticketing system for a health center, with a React frontend and Node.js backend.</w:t>
       </w:r>
     </w:p>
     <w:p>
@@ -295,7 +295,7 @@
         </w:numPr>
       </w:pPr>
       <w:r>
-        <w:t xml:space="preserve">Built a scheduling system for the same health center, with a React frontend and Node.js backend.</w:t>
+        <w:t xml:space="preserve">Built a scheduling system for the same health center, also in React and Node.js.</w:t>
       </w:r>
     </w:p>
     <w:p>

</xml_diff>

<commit_message>
Group JPMorgan bullets by purpose and split Skills into Data, Tools and AI
Co-Authored-By: Claude Opus 5.5 <noreply@anthropic.com>
</commit_message>
<xml_diff>
--- a/resume.docx
+++ b/resume.docx
@@ -115,7 +115,7 @@
       </w:r>
       <w:r>
         <w:tab/>
-        <w:t>JavaScript (ES6+), React, HTML, CSS, data visualization, virtualized rendering</w:t>
+        <w:t>JavaScript (ES6+), React, HTML, CSS, data visualization, virtualized rendering, client-side caching, state management</w:t>
       </w:r>
     </w:p>
     <w:p>
@@ -131,11 +131,11 @@
         <w:rPr>
           <w:b/>
         </w:rPr>
-        <w:t>Data &amp; Tools:</w:t>
+        <w:t>Data:</w:t>
       </w:r>
       <w:r>
         <w:tab/>
-        <w:t>Node.js, SQL, SQLite, IndexedDB (Dexie), REST APIs, WebSockets, Git</w:t>
+        <w:t>SQL, SQLite, IndexedDB (Dexie), Node.js, REST APIs, WebSockets</w:t>
       </w:r>
     </w:p>
     <w:p>
@@ -151,11 +151,31 @@
         <w:rPr>
           <w:b/>
         </w:rPr>
-        <w:t>AI Development:</w:t>
+        <w:t>Tools:</w:t>
       </w:r>
       <w:r>
         <w:tab/>
-        <w:t>Agentic software development, reusable project instructions, independent review</w:t>
+        <w:t>Git, GitHub, Vite, npm, Chrome DevTools, Netlify, Cloudflare</w:t>
+      </w:r>
+    </w:p>
+    <w:p>
+      <w:pPr>
+        <w:pStyle w:val="BodyText"/>
+        <w:tabs>
+          <w:tab w:pos="1760" w:val="left"/>
+        </w:tabs>
+        <w:spacing w:before="0" w:after="20"/>
+        <w:ind w:left="1760" w:hanging="1760"/>
+      </w:pPr>
+      <w:r>
+        <w:rPr>
+          <w:b/>
+        </w:rPr>
+        <w:t>AI:</w:t>
+      </w:r>
+      <w:r>
+        <w:tab/>
+        <w:t>Claude Code, Codex, agentic development, reusable project instructions</w:t>
       </w:r>
     </w:p>
     <w:bookmarkEnd w:id="25"/>
@@ -209,7 +229,7 @@
         </w:numPr>
       </w:pPr>
       <w:r>
-        <w:t xml:space="preserve">Built a multi-grid analytics workspace for large data sets. Served as its primary frontend engineer in the first year and continued to improve it.</w:t>
+        <w:t xml:space="preserve">Built a multi-grid analytics workspace for large data sets, with a React shell around a vanilla JavaScript grid core. Was its primary frontend engineer in the first year and kept improving it after.</w:t>
       </w:r>
     </w:p>
     <w:p>
@@ -221,7 +241,7 @@
         </w:numPr>
       </w:pPr>
       <w:r>
-        <w:t xml:space="preserve">Built a React shell around a vanilla JavaScript grid core with virtualized rendering. Added tools to visualize, explore, join, and pivot data.</w:t>
+        <w:t xml:space="preserve">Designed and built the UI/UX for charting and data manipulation, so users could explore, join, and pivot data across grids.</w:t>
       </w:r>
     </w:p>
     <w:p>
@@ -233,7 +253,7 @@
         </w:numPr>
       </w:pPr>
       <w:r>
-        <w:t xml:space="preserve">Built on-demand data loading and client-side caching for large, server-backed grids.</w:t>
+        <w:t xml:space="preserve">Kept large grids fast with virtualized rendering, on-demand loading of visible data over WebSockets, and client-side caching.</w:t>
       </w:r>
     </w:p>
     <w:p>
@@ -245,7 +265,7 @@
         </w:numPr>
       </w:pPr>
       <w:r>
-        <w:t xml:space="preserve">Helped introduce AI-assisted development for the analytics workspace. Guided coding agents with reusable project instructions and UI component standards.</w:t>
+        <w:t xml:space="preserve">Helped introduce AI-assisted development for the workspace. Guided coding agents with reusable project instructions and UI component standards.</w:t>
       </w:r>
     </w:p>
     <w:bookmarkEnd w:id="26"/>

</xml_diff>

<commit_message>
Add UI and AI-guardrail skills and size the label column to its labels
Co-Authored-By: Claude Opus 5.5 <noreply@anthropic.com>
</commit_message>
<xml_diff>
--- a/resume.docx
+++ b/resume.docx
@@ -102,10 +102,10 @@
       <w:pPr>
         <w:pStyle w:val="BodyText"/>
         <w:tabs>
-          <w:tab w:pos="1760" w:val="left"/>
+          <w:tab w:pos="1080" w:val="left"/>
         </w:tabs>
         <w:spacing w:before="0" w:after="20"/>
-        <w:ind w:left="1760" w:hanging="1760"/>
+        <w:ind w:left="1080" w:hanging="1080"/>
       </w:pPr>
       <w:r>
         <w:rPr>
@@ -115,17 +115,37 @@
       </w:r>
       <w:r>
         <w:tab/>
-        <w:t>JavaScript (ES6+), React, HTML, CSS, data visualization, virtualized rendering, client-side caching, state management</w:t>
+        <w:t>JavaScript (ES6+), React, HTML, CSS, state management, client-side caching, virtualized rendering</w:t>
       </w:r>
     </w:p>
     <w:p>
       <w:pPr>
         <w:pStyle w:val="BodyText"/>
         <w:tabs>
-          <w:tab w:pos="1760" w:val="left"/>
+          <w:tab w:pos="1080" w:val="left"/>
         </w:tabs>
         <w:spacing w:before="0" w:after="20"/>
-        <w:ind w:left="1760" w:hanging="1760"/>
+        <w:ind w:left="1080" w:hanging="1080"/>
+      </w:pPr>
+      <w:r>
+        <w:rPr>
+          <w:b/>
+        </w:rPr>
+        <w:t>UI:</w:t>
+      </w:r>
+      <w:r>
+        <w:tab/>
+        <w:t>Design systems, component libraries, data visualization, UI/UX design</w:t>
+      </w:r>
+    </w:p>
+    <w:p>
+      <w:pPr>
+        <w:pStyle w:val="BodyText"/>
+        <w:tabs>
+          <w:tab w:pos="1080" w:val="left"/>
+        </w:tabs>
+        <w:spacing w:before="0" w:after="20"/>
+        <w:ind w:left="1080" w:hanging="1080"/>
       </w:pPr>
       <w:r>
         <w:rPr>
@@ -142,10 +162,10 @@
       <w:pPr>
         <w:pStyle w:val="BodyText"/>
         <w:tabs>
-          <w:tab w:pos="1760" w:val="left"/>
+          <w:tab w:pos="1080" w:val="left"/>
         </w:tabs>
         <w:spacing w:before="0" w:after="20"/>
-        <w:ind w:left="1760" w:hanging="1760"/>
+        <w:ind w:left="1080" w:hanging="1080"/>
       </w:pPr>
       <w:r>
         <w:rPr>
@@ -162,10 +182,10 @@
       <w:pPr>
         <w:pStyle w:val="BodyText"/>
         <w:tabs>
-          <w:tab w:pos="1760" w:val="left"/>
+          <w:tab w:pos="1080" w:val="left"/>
         </w:tabs>
         <w:spacing w:before="0" w:after="20"/>
-        <w:ind w:left="1760" w:hanging="1760"/>
+        <w:ind w:left="1080" w:hanging="1080"/>
       </w:pPr>
       <w:r>
         <w:rPr>
@@ -175,7 +195,7 @@
       </w:r>
       <w:r>
         <w:tab/>
-        <w:t>Claude Code, Codex, agentic development, reusable project instructions</w:t>
+        <w:t>Claude Code, Codex, agentic development, context engineering, guardrails for AI-written code</w:t>
       </w:r>
     </w:p>
     <w:bookmarkEnd w:id="25"/>

</xml_diff>

<commit_message>
Tighten JPMorgan résumé bullets
</commit_message>
<xml_diff>
--- a/resume.docx
+++ b/resume.docx
@@ -249,7 +249,7 @@
         </w:numPr>
       </w:pPr>
       <w:r>
-        <w:t xml:space="preserve">Built a multi-grid analytics workspace for large data sets, with a React shell around a vanilla JavaScript grid core. Was its primary frontend engineer in the first year and kept improving it after.</w:t>
+        <w:t xml:space="preserve">Built and continued developing a multi-grid analytics workspace for large data sets, with a React shell around a vanilla JavaScript grid core. Primary frontend engineer in year one.</w:t>
       </w:r>
     </w:p>
     <w:p>
@@ -261,7 +261,7 @@
         </w:numPr>
       </w:pPr>
       <w:r>
-        <w:t xml:space="preserve">Designed and built the UI/UX for charting and data manipulation, so users could explore, join, and pivot data across grids.</w:t>
+        <w:t xml:space="preserve">Designed and built charting and data-manipulation interfaces to explore, join, and pivot data across grids.</w:t>
       </w:r>
     </w:p>
     <w:p>
@@ -285,7 +285,7 @@
         </w:numPr>
       </w:pPr>
       <w:r>
-        <w:t xml:space="preserve">Helped introduce AI-assisted development for the workspace. Guided coding agents with reusable project instructions and UI component standards.</w:t>
+        <w:t xml:space="preserve">Helped introduce AI-assisted development workflows with reusable project instructions and guardrails.</w:t>
       </w:r>
     </w:p>
     <w:bookmarkEnd w:id="26"/>

</xml_diff>

<commit_message>
Correct guardrails Skills wording and restore JPMorgan detail
</commit_message>
<xml_diff>
--- a/resume.docx
+++ b/resume.docx
@@ -195,7 +195,7 @@
       </w:r>
       <w:r>
         <w:tab/>
-        <w:t>Claude Code, Codex, agentic development, context engineering, guardrails for AI-written code</w:t>
+        <w:t>Claude Code, Codex, agentic development, context engineering, guardrails</w:t>
       </w:r>
     </w:p>
     <w:bookmarkEnd w:id="25"/>
@@ -285,7 +285,7 @@
         </w:numPr>
       </w:pPr>
       <w:r>
-        <w:t xml:space="preserve">Helped introduce AI-assisted development workflows with reusable project instructions and guardrails.</w:t>
+        <w:t xml:space="preserve">Helped introduce AI-assisted development for the workspace. Guided coding agents with reusable project instructions and UI component standards.</w:t>
       </w:r>
     </w:p>
     <w:bookmarkEnd w:id="26"/>

</xml_diff>

<commit_message>
Simplify résumé Skills labels and frontend entries
</commit_message>
<xml_diff>
--- a/resume.docx
+++ b/resume.docx
@@ -115,7 +115,7 @@
       </w:r>
       <w:r>
         <w:tab/>
-        <w:t>JavaScript (ES6+), React, HTML, CSS, state management, client-side caching, virtualized rendering, rapid prototyping</w:t>
+        <w:t>JavaScript, React, HTML, CSS, client-side caching, virtualized rendering, rapid prototyping</w:t>
       </w:r>
     </w:p>
     <w:p>
@@ -131,7 +131,7 @@
         <w:rPr>
           <w:b/>
         </w:rPr>
-        <w:t>UI:</w:t>
+        <w:t>UI/UX:</w:t>
       </w:r>
       <w:r>
         <w:tab/>
@@ -191,7 +191,7 @@
         <w:rPr>
           <w:b/>
         </w:rPr>
-        <w:t>AI:</w:t>
+        <w:t>AI Dev:</w:t>
       </w:r>
       <w:r>
         <w:tab/>

</xml_diff>

<commit_message>
Add Yunshang Tea design to Selected work and the résumé
Source: tanji-systems dev f792562b. PDF and DOCX regenerated (DOCX had still
listed Showdown).

Co-Authored-By: Claude Opus 5.5 <noreply@anthropic.com>
</commit_message>
<xml_diff>
--- a/resume.docx
+++ b/resume.docx
@@ -5,8 +5,7 @@
     <w:bookmarkStart w:id="23" w:name="brian-merriman"/>
     <w:p>
       <w:pPr>
-        <w:pStyle w:val="Title"/>
-        <w:jc w:val="left"/>
+        <w:pStyle w:val="Heading1"/>
       </w:pPr>
       <w:r>
         <w:t xml:space="preserve">Brian Merriman</w:t>
@@ -59,7 +58,10 @@
         <w:br/>
       </w:r>
       <w:r>
-        <w:t xml:space="preserve">Website: </w:t>
+        <w:t xml:space="preserve">Website:</w:t>
+      </w:r>
+      <w:r>
+        <w:t xml:space="preserve"> </w:t>
       </w:r>
       <w:hyperlink r:id="rId22">
         <w:r>
@@ -100,106 +102,96 @@
     </w:p>
     <w:p>
       <w:pPr>
-        <w:pStyle w:val="BodyText"/>
-        <w:tabs>
-          <w:tab w:pos="1080" w:val="left"/>
-        </w:tabs>
-        <w:spacing w:before="0" w:after="20"/>
-        <w:ind w:left="1080" w:hanging="1080"/>
+        <w:pStyle w:val="FirstParagraph"/>
       </w:pPr>
       <w:r>
         <w:rPr>
           <w:b/>
+          <w:bCs/>
         </w:rPr>
-        <w:t>Frontend:</w:t>
-      </w:r>
-      <w:r>
-        <w:tab/>
-        <w:t>JavaScript, React, HTML/CSS, virtualized rendering, rapid prototyping</w:t>
+        <w:t xml:space="preserve">Frontend:</w:t>
+      </w:r>
+      <w:r>
+        <w:t xml:space="preserve"> </w:t>
+      </w:r>
+      <w:r>
+        <w:t xml:space="preserve">JavaScript, React, HTML/CSS, virtualized rendering, rapid prototyping</w:t>
       </w:r>
     </w:p>
     <w:p>
       <w:pPr>
         <w:pStyle w:val="BodyText"/>
-        <w:tabs>
-          <w:tab w:pos="1080" w:val="left"/>
-        </w:tabs>
-        <w:spacing w:before="0" w:after="20"/>
-        <w:ind w:left="1080" w:hanging="1080"/>
       </w:pPr>
       <w:r>
         <w:rPr>
           <w:b/>
+          <w:bCs/>
         </w:rPr>
-        <w:t>UI/UX:</w:t>
-      </w:r>
-      <w:r>
-        <w:tab/>
-        <w:t>Design systems, component libraries, data visualization, UI/UX design</w:t>
+        <w:t xml:space="preserve">UI/UX:</w:t>
+      </w:r>
+      <w:r>
+        <w:t xml:space="preserve"> </w:t>
+      </w:r>
+      <w:r>
+        <w:t xml:space="preserve">Design systems, component libraries, data visualization, UI/UX design</w:t>
       </w:r>
     </w:p>
     <w:p>
       <w:pPr>
         <w:pStyle w:val="BodyText"/>
-        <w:tabs>
-          <w:tab w:pos="1080" w:val="left"/>
-        </w:tabs>
-        <w:spacing w:before="0" w:after="20"/>
-        <w:ind w:left="1080" w:hanging="1080"/>
       </w:pPr>
       <w:r>
         <w:rPr>
           <w:b/>
+          <w:bCs/>
         </w:rPr>
-        <w:t>Data:</w:t>
-      </w:r>
-      <w:r>
-        <w:tab/>
-        <w:t>SQL, SQLite, IndexedDB (Dexie), Node.js, REST APIs, WebSockets</w:t>
+        <w:t xml:space="preserve">Data:</w:t>
+      </w:r>
+      <w:r>
+        <w:t xml:space="preserve"> </w:t>
+      </w:r>
+      <w:r>
+        <w:t xml:space="preserve">SQL, SQLite, IndexedDB (Dexie), Node.js, REST APIs, WebSockets</w:t>
       </w:r>
     </w:p>
     <w:p>
       <w:pPr>
         <w:pStyle w:val="BodyText"/>
-        <w:tabs>
-          <w:tab w:pos="1080" w:val="left"/>
-        </w:tabs>
-        <w:spacing w:before="0" w:after="20"/>
-        <w:ind w:left="1080" w:hanging="1080"/>
       </w:pPr>
       <w:r>
         <w:rPr>
           <w:b/>
+          <w:bCs/>
         </w:rPr>
-        <w:t>Tools:</w:t>
-      </w:r>
-      <w:r>
-        <w:tab/>
-        <w:t>Git, GitHub, Vite, npm, Chrome DevTools</w:t>
+        <w:t xml:space="preserve">Tools:</w:t>
+      </w:r>
+      <w:r>
+        <w:t xml:space="preserve"> </w:t>
+      </w:r>
+      <w:r>
+        <w:t xml:space="preserve">Git, GitHub, Vite, npm, Chrome DevTools</w:t>
       </w:r>
     </w:p>
     <w:p>
       <w:pPr>
         <w:pStyle w:val="BodyText"/>
-        <w:tabs>
-          <w:tab w:pos="1080" w:val="left"/>
-        </w:tabs>
-        <w:spacing w:before="0" w:after="20"/>
-        <w:ind w:left="1080" w:hanging="1080"/>
       </w:pPr>
       <w:r>
         <w:rPr>
           <w:b/>
+          <w:bCs/>
         </w:rPr>
-        <w:t>AI Dev:</w:t>
-      </w:r>
-      <w:r>
-        <w:tab/>
-        <w:t>Claude Code, Codex, agentic development, context engineering, guardrails</w:t>
+        <w:t xml:space="preserve">AI Dev:</w:t>
+      </w:r>
+      <w:r>
+        <w:t xml:space="preserve"> </w:t>
+      </w:r>
+      <w:r>
+        <w:t xml:space="preserve">Claude Code, Codex, agentic development, context engineering, guardrails</w:t>
       </w:r>
     </w:p>
     <w:bookmarkEnd w:id="25"/>
-    <w:bookmarkStart w:id="29" w:name="work-experience"/>
+    <w:bookmarkStart w:id="30" w:name="work-experience"/>
     <w:p>
       <w:pPr>
         <w:pStyle w:val="Heading2"/>
@@ -214,14 +206,13 @@
         <w:pStyle w:val="Heading3"/>
       </w:pPr>
       <w:r>
-        <w:t>JPMorgan Chase</w:t>
-      </w:r>
-      <w:r>
-        <w:rPr>
-          <w:b w:val="0"/>
-          <w:sz w:val="20"/>
-        </w:rPr>
-        <w:t xml:space="preserve"> | New York, NY | January 2023 - May 2026</w:t>
+        <w:t xml:space="preserve">JPMorgan Chase</w:t>
+      </w:r>
+      <w:r>
+        <w:t xml:space="preserve"> </w:t>
+      </w:r>
+      <w:r>
+        <w:t xml:space="preserve">| New York, NY | January 2023 - May 2026</w:t>
       </w:r>
     </w:p>
     <w:p>
@@ -289,21 +280,19 @@
       </w:r>
     </w:p>
     <w:bookmarkEnd w:id="26"/>
-    <w:bookmarkStart w:id="27" w:name="okg-tech-new-york-ny"/>
+    <w:bookmarkStart w:id="27" w:name="okg-tech-monsey-ny"/>
     <w:p>
       <w:pPr>
         <w:pStyle w:val="Heading3"/>
-        <w:spacing w:before="140"/>
-      </w:pPr>
-      <w:r>
-        <w:t>OKG Tech</w:t>
-      </w:r>
-      <w:r>
-        <w:rPr>
-          <w:b w:val="0"/>
-          <w:sz w:val="20"/>
-        </w:rPr>
-        <w:t xml:space="preserve"> | Monsey, NY</w:t>
+      </w:pPr>
+      <w:r>
+        <w:t xml:space="preserve">OKG Tech</w:t>
+      </w:r>
+      <w:r>
+        <w:t xml:space="preserve"> </w:t>
+      </w:r>
+      <w:r>
+        <w:t xml:space="preserve">| Monsey, NY</w:t>
       </w:r>
     </w:p>
     <w:p>
@@ -351,21 +340,19 @@
       </w:r>
     </w:p>
     <w:bookmarkEnd w:id="27"/>
-    <w:bookmarkStart w:id="28" w:name="yunshang-tea-zhejiang-china"/>
+    <w:bookmarkStart w:id="29" w:name="yunshang-tea-zhejiang-china"/>
     <w:p>
       <w:pPr>
         <w:pStyle w:val="Heading3"/>
-        <w:spacing w:before="140"/>
-      </w:pPr>
-      <w:r>
-        <w:t>Yunshang Tea</w:t>
-      </w:r>
-      <w:r>
-        <w:rPr>
-          <w:b w:val="0"/>
-          <w:sz w:val="20"/>
-        </w:rPr>
-        <w:t xml:space="preserve"> | Zhejiang, China</w:t>
+      </w:pPr>
+      <w:r>
+        <w:t xml:space="preserve">Yunshang Tea</w:t>
+      </w:r>
+      <w:r>
+        <w:t xml:space="preserve"> </w:t>
+      </w:r>
+      <w:r>
+        <w:t xml:space="preserve">| Zhejiang, China</w:t>
       </w:r>
     </w:p>
     <w:p>
@@ -400,9 +387,32 @@
         <w:t xml:space="preserve">Built database workflows for inventory, sales, and business operations.</w:t>
       </w:r>
     </w:p>
-    <w:bookmarkEnd w:id="28"/>
+    <w:p>
+      <w:pPr>
+        <w:pStyle w:val="Compact"/>
+        <w:numPr>
+          <w:ilvl w:val="0"/>
+          <w:numId w:val="1003"/>
+        </w:numPr>
+      </w:pPr>
+      <w:r>
+        <w:t xml:space="preserve">Designed packaging, posters, retail signs, and shop pages with Huifang Yu:</w:t>
+      </w:r>
+      <w:r>
+        <w:t xml:space="preserve"> </w:t>
+      </w:r>
+      <w:hyperlink r:id="rId28">
+        <w:r>
+          <w:rPr>
+            <w:rStyle w:val="Hyperlink"/>
+          </w:rPr>
+          <w:t xml:space="preserve">merriman.xyz/yunshang</w:t>
+        </w:r>
+      </w:hyperlink>
+    </w:p>
     <w:bookmarkEnd w:id="29"/>
-    <w:bookmarkStart w:id="34" w:name="selected-projects"/>
+    <w:bookmarkEnd w:id="30"/>
+    <w:bookmarkStart w:id="33" w:name="selected-projects"/>
     <w:p>
       <w:pPr>
         <w:pStyle w:val="Heading2"/>
@@ -411,12 +421,12 @@
         <w:t xml:space="preserve">Selected Projects</w:t>
       </w:r>
     </w:p>
-    <w:bookmarkStart w:id="31" w:name="ingrid-2026"/>
+    <w:bookmarkStart w:id="32" w:name="ingrid-2026"/>
     <w:p>
       <w:pPr>
         <w:pStyle w:val="Heading3"/>
       </w:pPr>
-      <w:hyperlink r:id="rId30">
+      <w:hyperlink r:id="rId31">
         <w:r>
           <w:rPr>
             <w:rStyle w:val="Hyperlink"/>
@@ -440,7 +450,7 @@
         </w:numPr>
       </w:pPr>
       <w:r>
-        <w:t xml:space="preserve">Shipped a local-first grid app with a React shell and vanilla JavaScript editor core. Added virtualized rendering, multi-device sync, and subscription billing.</w:t>
+        <w:t xml:space="preserve">Built Ingrid’s original codebase and subsequently extended it through AI-assisted development.</w:t>
       </w:r>
     </w:p>
     <w:p>
@@ -452,29 +462,7 @@
         </w:numPr>
       </w:pPr>
       <w:r>
-        <w:t xml:space="preserve">Directed development of an AI editing prototype within Ingrid. It previews changes to selected content before applying them and supports undo and redo.</w:t>
-      </w:r>
-    </w:p>
-    <w:bookmarkEnd w:id="31"/>
-    <w:bookmarkStart w:id="33" w:name="showdown-elo-2026"/>
-    <w:p>
-      <w:pPr>
-        <w:pStyle w:val="Heading3"/>
-        <w:spacing w:before="140"/>
-      </w:pPr>
-      <w:hyperlink r:id="rId32">
-        <w:r>
-          <w:rPr>
-            <w:rStyle w:val="Hyperlink"/>
-          </w:rPr>
-          <w:t xml:space="preserve">Showdown Elo</w:t>
-        </w:r>
-      </w:hyperlink>
-      <w:r>
-        <w:t xml:space="preserve"> </w:t>
-      </w:r>
-      <w:r>
-        <w:t xml:space="preserve">(2026)</w:t>
+        <w:t xml:space="preserve">Shipped a local-first grid app with a React shell and vanilla JavaScript editor core. Added multi-device sync and subscription billing.</w:t>
       </w:r>
     </w:p>
     <w:p>
@@ -482,51 +470,51 @@
         <w:pStyle w:val="Compact"/>
         <w:numPr>
           <w:ilvl w:val="0"/>
-          <w:numId w:val="1005"/>
+          <w:numId w:val="1004"/>
         </w:numPr>
       </w:pPr>
       <w:r>
-        <w:t xml:space="preserve">Built an automated nightly Major League Baseball (MLB) ratings site. It rates hitters and pitchers from plate appearances using Elo.</w:t>
-      </w:r>
-    </w:p>
+        <w:t xml:space="preserve">Directed development of an AI editing prototype within Ingrid. Users can preview AI-generated edits before applying them, then undo or redo changes.</w:t>
+      </w:r>
+    </w:p>
+    <w:bookmarkEnd w:id="32"/>
     <w:bookmarkEnd w:id="33"/>
+    <w:bookmarkStart w:id="35" w:name="education"/>
+    <w:p>
+      <w:pPr>
+        <w:pStyle w:val="Heading2"/>
+      </w:pPr>
+      <w:r>
+        <w:t xml:space="preserve">Education</w:t>
+      </w:r>
+    </w:p>
+    <w:bookmarkStart w:id="34" w:name="manhattan-college"/>
+    <w:p>
+      <w:pPr>
+        <w:pStyle w:val="Heading3"/>
+      </w:pPr>
+      <w:r>
+        <w:t xml:space="preserve">Manhattan College</w:t>
+      </w:r>
+    </w:p>
+    <w:p>
+      <w:pPr>
+        <w:pStyle w:val="FirstParagraph"/>
+      </w:pPr>
+      <w:r>
+        <w:t xml:space="preserve">Bachelor of Arts (BA) in Computer Science</w:t>
+      </w:r>
+    </w:p>
+    <w:p>
+      <w:pPr>
+        <w:pStyle w:val="BodyText"/>
+      </w:pPr>
+      <w:r>
+        <w:t xml:space="preserve">Bronx, NY | magna cum laude | Phi Beta Kappa</w:t>
+      </w:r>
+    </w:p>
     <w:bookmarkEnd w:id="34"/>
-    <w:bookmarkStart w:id="36" w:name="education"/>
-    <w:p>
-      <w:pPr>
-        <w:pStyle w:val="Heading2"/>
-      </w:pPr>
-      <w:r>
-        <w:t xml:space="preserve">Education</w:t>
-      </w:r>
-    </w:p>
-    <w:bookmarkStart w:id="35" w:name="manhattan-college"/>
-    <w:p>
-      <w:pPr>
-        <w:pStyle w:val="Heading3"/>
-      </w:pPr>
-      <w:r>
-        <w:t xml:space="preserve">Manhattan College</w:t>
-      </w:r>
-    </w:p>
-    <w:p>
-      <w:pPr>
-        <w:pStyle w:val="FirstParagraph"/>
-      </w:pPr>
-      <w:r>
-        <w:t xml:space="preserve">Bachelor of Arts (BA) in Computer Science</w:t>
-      </w:r>
-    </w:p>
-    <w:p>
-      <w:pPr>
-        <w:pStyle w:val="BodyText"/>
-      </w:pPr>
-      <w:r>
-        <w:t xml:space="preserve">Bronx, NY | magna cum laude | Phi Beta Kappa</w:t>
-      </w:r>
-    </w:p>
     <w:bookmarkEnd w:id="35"/>
-    <w:bookmarkEnd w:id="36"/>
     <w:sectPr>
       <w:footnotePr>
         <w:numRestart w:val="eachSect"/>
@@ -647,10 +635,7 @@
       <w:lvlText w:val=""/>
       <w:lvlJc w:val="left"/>
       <w:pPr>
-        <w:tabs>
-          <w:tab w:val="num" w:pos="280"/>
-        </w:tabs>
-        <w:ind w:left="280" w:hanging="240"/>
+        <w:ind w:left="720" w:hanging="360"/>
       </w:pPr>
       <w:rPr>
         <w:rFonts w:ascii="Symbol" w:hAnsi="Symbol" w:cs="Symbol" w:hint="default"/>
@@ -758,9 +743,6 @@
     <w:abstractNumId w:val="991"/>
   </w:num>
   <w:num w:numId="1004">
-    <w:abstractNumId w:val="991"/>
-  </w:num>
-  <w:num w:numId="1005">
     <w:abstractNumId w:val="991"/>
   </w:num>
 </w:numbering>

</xml_diff>